<commit_message>
Hogar de Refugio: indice de planos en el orden del PDF del usuario (por formato), codigos del rotulo sin renumerar
Co-Authored-By: Claude Opus 5.5 <noreply@anthropic.com>
Claude-Session: https://claude.ai/code/session_0142t8T16igb3VKxUPwnQPq6
</commit_message>
<xml_diff>
--- a/entregables/INDICE_DE_PLANOS_DRENAJE_PLUVIAL_HOGAR_REFUGIO.docx
+++ b/entregables/INDICE_DE_PLANOS_DRENAJE_PLUVIAL_HOGAR_REFUGIO.docx
@@ -221,7 +221,6 @@
       <w:tr>
         <w:trPr>
           <w:cantSplit/>
-          <w:cantSplit/>
         </w:trPr>
         <w:tc>
           <w:tcPr>
@@ -243,7 +242,7 @@
                 <w:color w:val="7B1E2B"/>
                 <w:sz w:val="15"/>
               </w:rPr>
-              <w:t>RED DE CUNETAS  (DPL-01 A DPL-05)</w:t>
+              <w:t>LÁMINAS EN FORMATO A0  (4)</w:t>
             </w:r>
           </w:p>
         </w:tc>
@@ -561,6 +560,1271 @@
                 <w:color w:val="7B1E2B"/>
                 <w:sz w:val="16"/>
               </w:rPr>
+              <w:t>DPL-06</w:t>
+            </w:r>
+          </w:p>
+        </w:tc>
+        <w:tc>
+          <w:tcPr>
+            <w:tcW w:type="dxa" w:w="6407"/>
+            <w:vAlign w:val="center"/>
+          </w:tcPr>
+          <w:p>
+            <w:pPr>
+              <w:spacing w:before="20" w:after="20" w:line="240" w:lineRule="auto"/>
+              <w:jc w:val="left"/>
+            </w:pPr>
+            <w:r>
+              <w:rPr>
+                <w:rFonts w:ascii="Arial" w:hAnsi="Arial" w:eastAsia="Arial"/>
+                <w:b/>
+                <w:i w:val="0"/>
+                <w:sz w:val="16"/>
+              </w:rPr>
+              <w:t>RED GENERAL COLECTOR PLUVIAL</w:t>
+            </w:r>
+          </w:p>
+        </w:tc>
+        <w:tc>
+          <w:tcPr>
+            <w:tcW w:type="dxa" w:w="1020"/>
+            <w:vAlign w:val="center"/>
+          </w:tcPr>
+          <w:p>
+            <w:pPr>
+              <w:spacing w:before="20" w:after="20" w:line="240" w:lineRule="auto"/>
+              <w:jc w:val="center"/>
+            </w:pPr>
+            <w:r>
+              <w:rPr>
+                <w:rFonts w:ascii="Arial" w:hAnsi="Arial" w:eastAsia="Arial"/>
+                <w:b w:val="0"/>
+                <w:i w:val="0"/>
+                <w:sz w:val="16"/>
+              </w:rPr>
+              <w:t>A0</w:t>
+            </w:r>
+          </w:p>
+        </w:tc>
+        <w:tc>
+          <w:tcPr>
+            <w:tcW w:type="dxa" w:w="1077"/>
+            <w:vAlign w:val="center"/>
+          </w:tcPr>
+          <w:p>
+            <w:pPr>
+              <w:spacing w:before="20" w:after="20" w:line="240" w:lineRule="auto"/>
+              <w:jc w:val="center"/>
+            </w:pPr>
+            <w:r>
+              <w:rPr>
+                <w:rFonts w:ascii="Arial" w:hAnsi="Arial" w:eastAsia="Arial"/>
+                <w:b w:val="0"/>
+                <w:i w:val="0"/>
+                <w:sz w:val="16"/>
+              </w:rPr>
+              <w:t>INDICADA</w:t>
+            </w:r>
+          </w:p>
+          <w:p>
+            <w:pPr>
+              <w:spacing w:before="0" w:after="20" w:line="240" w:lineRule="auto"/>
+              <w:jc w:val="center"/>
+            </w:pPr>
+            <w:r>
+              <w:rPr>
+                <w:rFonts w:ascii="Arial" w:hAnsi="Arial" w:eastAsia="Arial"/>
+                <w:b w:val="0"/>
+                <w:i w:val="0"/>
+                <w:color w:val="595959"/>
+                <w:sz w:val="13"/>
+              </w:rPr>
+              <w:t>1/130</w:t>
+            </w:r>
+          </w:p>
+        </w:tc>
+      </w:tr>
+      <w:tr>
+        <w:trPr>
+          <w:cantSplit/>
+        </w:trPr>
+        <w:tc>
+          <w:tcPr>
+            <w:tcW w:type="dxa" w:w="454"/>
+            <w:vAlign w:val="center"/>
+          </w:tcPr>
+          <w:p>
+            <w:pPr>
+              <w:spacing w:before="20" w:after="20" w:line="240" w:lineRule="auto"/>
+              <w:jc w:val="center"/>
+            </w:pPr>
+            <w:r>
+              <w:rPr>
+                <w:rFonts w:ascii="Arial" w:hAnsi="Arial" w:eastAsia="Arial"/>
+                <w:b w:val="0"/>
+                <w:i w:val="0"/>
+                <w:sz w:val="16"/>
+              </w:rPr>
+              <w:t>04</w:t>
+            </w:r>
+          </w:p>
+        </w:tc>
+        <w:tc>
+          <w:tcPr>
+            <w:tcW w:type="dxa" w:w="907"/>
+            <w:vAlign w:val="center"/>
+          </w:tcPr>
+          <w:p>
+            <w:pPr>
+              <w:spacing w:before="20" w:after="20" w:line="240" w:lineRule="auto"/>
+              <w:jc w:val="center"/>
+            </w:pPr>
+            <w:r>
+              <w:rPr>
+                <w:rFonts w:ascii="Arial" w:hAnsi="Arial" w:eastAsia="Arial"/>
+                <w:b/>
+                <w:i w:val="0"/>
+                <w:color w:val="7B1E2B"/>
+                <w:sz w:val="16"/>
+              </w:rPr>
+              <w:t>DPL-39</w:t>
+            </w:r>
+          </w:p>
+        </w:tc>
+        <w:tc>
+          <w:tcPr>
+            <w:tcW w:type="dxa" w:w="6407"/>
+            <w:vAlign w:val="center"/>
+          </w:tcPr>
+          <w:p>
+            <w:pPr>
+              <w:spacing w:before="20" w:after="20" w:line="240" w:lineRule="auto"/>
+              <w:jc w:val="left"/>
+            </w:pPr>
+            <w:r>
+              <w:rPr>
+                <w:rFonts w:ascii="Arial" w:hAnsi="Arial" w:eastAsia="Arial"/>
+                <w:b/>
+                <w:i w:val="0"/>
+                <w:sz w:val="16"/>
+              </w:rPr>
+              <w:t>PLANTA DE UBICACIÓN DE LLORADEROS EN CUNETAS COLINDANTES CON ÁREA VERDE</w:t>
+            </w:r>
+          </w:p>
+        </w:tc>
+        <w:tc>
+          <w:tcPr>
+            <w:tcW w:type="dxa" w:w="1020"/>
+            <w:vAlign w:val="center"/>
+          </w:tcPr>
+          <w:p>
+            <w:pPr>
+              <w:spacing w:before="20" w:after="20" w:line="240" w:lineRule="auto"/>
+              <w:jc w:val="center"/>
+            </w:pPr>
+            <w:r>
+              <w:rPr>
+                <w:rFonts w:ascii="Arial" w:hAnsi="Arial" w:eastAsia="Arial"/>
+                <w:b w:val="0"/>
+                <w:i w:val="0"/>
+                <w:sz w:val="16"/>
+              </w:rPr>
+              <w:t>A0</w:t>
+            </w:r>
+          </w:p>
+        </w:tc>
+        <w:tc>
+          <w:tcPr>
+            <w:tcW w:type="dxa" w:w="1077"/>
+            <w:vAlign w:val="center"/>
+          </w:tcPr>
+          <w:p>
+            <w:pPr>
+              <w:spacing w:before="20" w:after="20" w:line="240" w:lineRule="auto"/>
+              <w:jc w:val="center"/>
+            </w:pPr>
+            <w:r>
+              <w:rPr>
+                <w:rFonts w:ascii="Arial" w:hAnsi="Arial" w:eastAsia="Arial"/>
+                <w:b w:val="0"/>
+                <w:i w:val="0"/>
+                <w:sz w:val="16"/>
+              </w:rPr>
+              <w:t>INDICADA</w:t>
+            </w:r>
+          </w:p>
+          <w:p>
+            <w:pPr>
+              <w:spacing w:before="0" w:after="20" w:line="240" w:lineRule="auto"/>
+              <w:jc w:val="center"/>
+            </w:pPr>
+            <w:r>
+              <w:rPr>
+                <w:rFonts w:ascii="Arial" w:hAnsi="Arial" w:eastAsia="Arial"/>
+                <w:b w:val="0"/>
+                <w:i w:val="0"/>
+                <w:color w:val="595959"/>
+                <w:sz w:val="13"/>
+              </w:rPr>
+              <w:t>1/180</w:t>
+            </w:r>
+          </w:p>
+        </w:tc>
+      </w:tr>
+      <w:tr>
+        <w:trPr>
+          <w:cantSplit/>
+        </w:trPr>
+        <w:tc>
+          <w:tcPr>
+            <w:tcW w:type="dxa" w:w="9864"/>
+            <w:gridSpan w:val="5"/>
+            <w:shd w:val="clear" w:color="auto" w:fill="F2E6E8"/>
+            <w:vAlign w:val="center"/>
+          </w:tcPr>
+          <w:p>
+            <w:pPr>
+              <w:spacing w:before="20" w:after="20" w:line="240" w:lineRule="auto"/>
+              <w:jc w:val="left"/>
+            </w:pPr>
+            <w:r>
+              <w:rPr>
+                <w:rFonts w:ascii="Arial" w:hAnsi="Arial" w:eastAsia="Arial"/>
+                <w:b/>
+                <w:i w:val="0"/>
+                <w:color w:val="7B1E2B"/>
+                <w:sz w:val="15"/>
+              </w:rPr>
+              <w:t>LÁMINAS EN FORMATO A1  (7)</w:t>
+            </w:r>
+          </w:p>
+        </w:tc>
+      </w:tr>
+      <w:tr>
+        <w:trPr>
+          <w:cantSplit/>
+        </w:trPr>
+        <w:tc>
+          <w:tcPr>
+            <w:tcW w:type="dxa" w:w="454"/>
+            <w:vAlign w:val="center"/>
+          </w:tcPr>
+          <w:p>
+            <w:pPr>
+              <w:spacing w:before="20" w:after="20" w:line="240" w:lineRule="auto"/>
+              <w:jc w:val="center"/>
+            </w:pPr>
+            <w:r>
+              <w:rPr>
+                <w:rFonts w:ascii="Arial" w:hAnsi="Arial" w:eastAsia="Arial"/>
+                <w:b w:val="0"/>
+                <w:i w:val="0"/>
+                <w:sz w:val="16"/>
+              </w:rPr>
+              <w:t>05</w:t>
+            </w:r>
+          </w:p>
+        </w:tc>
+        <w:tc>
+          <w:tcPr>
+            <w:tcW w:type="dxa" w:w="907"/>
+            <w:vAlign w:val="center"/>
+          </w:tcPr>
+          <w:p>
+            <w:pPr>
+              <w:spacing w:before="20" w:after="20" w:line="240" w:lineRule="auto"/>
+              <w:jc w:val="center"/>
+            </w:pPr>
+            <w:r>
+              <w:rPr>
+                <w:rFonts w:ascii="Arial" w:hAnsi="Arial" w:eastAsia="Arial"/>
+                <w:b/>
+                <w:i w:val="0"/>
+                <w:color w:val="7B1E2B"/>
+                <w:sz w:val="16"/>
+              </w:rPr>
+              <w:t>DPL-07</w:t>
+            </w:r>
+          </w:p>
+        </w:tc>
+        <w:tc>
+          <w:tcPr>
+            <w:tcW w:type="dxa" w:w="6407"/>
+            <w:vAlign w:val="center"/>
+          </w:tcPr>
+          <w:p>
+            <w:pPr>
+              <w:spacing w:before="20" w:after="20" w:line="240" w:lineRule="auto"/>
+              <w:jc w:val="left"/>
+            </w:pPr>
+            <w:r>
+              <w:rPr>
+                <w:rFonts w:ascii="Arial" w:hAnsi="Arial" w:eastAsia="Arial"/>
+                <w:b/>
+                <w:i w:val="0"/>
+                <w:sz w:val="16"/>
+              </w:rPr>
+              <w:t>PERFIL LONGITUDINAL GENERAL DEL COLECTOR</w:t>
+            </w:r>
+          </w:p>
+          <w:p>
+            <w:pPr>
+              <w:spacing w:before="0" w:after="20" w:line="240" w:lineRule="auto"/>
+              <w:jc w:val="left"/>
+            </w:pPr>
+            <w:r>
+              <w:rPr>
+                <w:rFonts w:ascii="Arial" w:hAnsi="Arial" w:eastAsia="Arial"/>
+                <w:b w:val="0"/>
+                <w:i w:val="0"/>
+                <w:color w:val="595959"/>
+                <w:sz w:val="13"/>
+              </w:rPr>
+              <w:t>PROGRESIVAS 0+000.00 A 0+073.39</w:t>
+            </w:r>
+          </w:p>
+        </w:tc>
+        <w:tc>
+          <w:tcPr>
+            <w:tcW w:type="dxa" w:w="1020"/>
+            <w:vAlign w:val="center"/>
+          </w:tcPr>
+          <w:p>
+            <w:pPr>
+              <w:spacing w:before="20" w:after="20" w:line="240" w:lineRule="auto"/>
+              <w:jc w:val="center"/>
+            </w:pPr>
+            <w:r>
+              <w:rPr>
+                <w:rFonts w:ascii="Arial" w:hAnsi="Arial" w:eastAsia="Arial"/>
+                <w:b w:val="0"/>
+                <w:i w:val="0"/>
+                <w:sz w:val="16"/>
+              </w:rPr>
+              <w:t>A1</w:t>
+            </w:r>
+          </w:p>
+        </w:tc>
+        <w:tc>
+          <w:tcPr>
+            <w:tcW w:type="dxa" w:w="1077"/>
+            <w:vAlign w:val="center"/>
+          </w:tcPr>
+          <w:p>
+            <w:pPr>
+              <w:spacing w:before="20" w:after="20" w:line="240" w:lineRule="auto"/>
+              <w:jc w:val="center"/>
+            </w:pPr>
+            <w:r>
+              <w:rPr>
+                <w:rFonts w:ascii="Arial" w:hAnsi="Arial" w:eastAsia="Arial"/>
+                <w:b w:val="0"/>
+                <w:i w:val="0"/>
+                <w:sz w:val="16"/>
+              </w:rPr>
+              <w:t>INDICADA</w:t>
+            </w:r>
+          </w:p>
+          <w:p>
+            <w:pPr>
+              <w:spacing w:before="0" w:after="20" w:line="240" w:lineRule="auto"/>
+              <w:jc w:val="center"/>
+            </w:pPr>
+            <w:r>
+              <w:rPr>
+                <w:rFonts w:ascii="Arial" w:hAnsi="Arial" w:eastAsia="Arial"/>
+                <w:b w:val="0"/>
+                <w:i w:val="0"/>
+                <w:color w:val="595959"/>
+                <w:sz w:val="13"/>
+              </w:rPr>
+              <w:t>1/55</w:t>
+            </w:r>
+          </w:p>
+        </w:tc>
+      </w:tr>
+      <w:tr>
+        <w:trPr>
+          <w:cantSplit/>
+        </w:trPr>
+        <w:tc>
+          <w:tcPr>
+            <w:tcW w:type="dxa" w:w="454"/>
+            <w:vAlign w:val="center"/>
+          </w:tcPr>
+          <w:p>
+            <w:pPr>
+              <w:spacing w:before="20" w:after="20" w:line="240" w:lineRule="auto"/>
+              <w:jc w:val="center"/>
+            </w:pPr>
+            <w:r>
+              <w:rPr>
+                <w:rFonts w:ascii="Arial" w:hAnsi="Arial" w:eastAsia="Arial"/>
+                <w:b w:val="0"/>
+                <w:i w:val="0"/>
+                <w:sz w:val="16"/>
+              </w:rPr>
+              <w:t>06</w:t>
+            </w:r>
+          </w:p>
+        </w:tc>
+        <w:tc>
+          <w:tcPr>
+            <w:tcW w:type="dxa" w:w="907"/>
+            <w:vAlign w:val="center"/>
+          </w:tcPr>
+          <w:p>
+            <w:pPr>
+              <w:spacing w:before="20" w:after="20" w:line="240" w:lineRule="auto"/>
+              <w:jc w:val="center"/>
+            </w:pPr>
+            <w:r>
+              <w:rPr>
+                <w:rFonts w:ascii="Arial" w:hAnsi="Arial" w:eastAsia="Arial"/>
+                <w:b/>
+                <w:i w:val="0"/>
+                <w:color w:val="7B1E2B"/>
+                <w:sz w:val="16"/>
+              </w:rPr>
+              <w:t>DPL-18</w:t>
+            </w:r>
+          </w:p>
+        </w:tc>
+        <w:tc>
+          <w:tcPr>
+            <w:tcW w:type="dxa" w:w="6407"/>
+            <w:vAlign w:val="center"/>
+          </w:tcPr>
+          <w:p>
+            <w:pPr>
+              <w:spacing w:before="20" w:after="20" w:line="240" w:lineRule="auto"/>
+              <w:jc w:val="left"/>
+            </w:pPr>
+            <w:r>
+              <w:rPr>
+                <w:rFonts w:ascii="Arial" w:hAnsi="Arial" w:eastAsia="Arial"/>
+                <w:b/>
+                <w:i w:val="0"/>
+                <w:sz w:val="16"/>
+              </w:rPr>
+              <w:t>DETALLE MONTANTE - EDIF04</w:t>
+            </w:r>
+          </w:p>
+          <w:p>
+            <w:pPr>
+              <w:spacing w:before="0" w:after="20" w:line="240" w:lineRule="auto"/>
+              <w:jc w:val="left"/>
+            </w:pPr>
+            <w:r>
+              <w:rPr>
+                <w:rFonts w:ascii="Arial" w:hAnsi="Arial" w:eastAsia="Arial"/>
+                <w:b w:val="0"/>
+                <w:i w:val="0"/>
+                <w:color w:val="595959"/>
+                <w:sz w:val="13"/>
+              </w:rPr>
+              <w:t>CORTE A-A</w:t>
+            </w:r>
+          </w:p>
+        </w:tc>
+        <w:tc>
+          <w:tcPr>
+            <w:tcW w:type="dxa" w:w="1020"/>
+            <w:vAlign w:val="center"/>
+          </w:tcPr>
+          <w:p>
+            <w:pPr>
+              <w:spacing w:before="20" w:after="20" w:line="240" w:lineRule="auto"/>
+              <w:jc w:val="center"/>
+            </w:pPr>
+            <w:r>
+              <w:rPr>
+                <w:rFonts w:ascii="Arial" w:hAnsi="Arial" w:eastAsia="Arial"/>
+                <w:b w:val="0"/>
+                <w:i w:val="0"/>
+                <w:sz w:val="16"/>
+              </w:rPr>
+              <w:t>A1</w:t>
+            </w:r>
+          </w:p>
+        </w:tc>
+        <w:tc>
+          <w:tcPr>
+            <w:tcW w:type="dxa" w:w="1077"/>
+            <w:vAlign w:val="center"/>
+          </w:tcPr>
+          <w:p>
+            <w:pPr>
+              <w:spacing w:before="20" w:after="20" w:line="240" w:lineRule="auto"/>
+              <w:jc w:val="center"/>
+            </w:pPr>
+            <w:r>
+              <w:rPr>
+                <w:rFonts w:ascii="Arial" w:hAnsi="Arial" w:eastAsia="Arial"/>
+                <w:b w:val="0"/>
+                <w:i w:val="0"/>
+                <w:sz w:val="16"/>
+              </w:rPr>
+              <w:t>INDICADA</w:t>
+            </w:r>
+          </w:p>
+          <w:p>
+            <w:pPr>
+              <w:spacing w:before="0" w:after="20" w:line="240" w:lineRule="auto"/>
+              <w:jc w:val="center"/>
+            </w:pPr>
+            <w:r>
+              <w:rPr>
+                <w:rFonts w:ascii="Arial" w:hAnsi="Arial" w:eastAsia="Arial"/>
+                <w:b w:val="0"/>
+                <w:i w:val="0"/>
+                <w:color w:val="595959"/>
+                <w:sz w:val="13"/>
+              </w:rPr>
+              <w:t>1/70</w:t>
+            </w:r>
+          </w:p>
+        </w:tc>
+      </w:tr>
+      <w:tr>
+        <w:trPr>
+          <w:cantSplit/>
+        </w:trPr>
+        <w:tc>
+          <w:tcPr>
+            <w:tcW w:type="dxa" w:w="454"/>
+            <w:vAlign w:val="center"/>
+          </w:tcPr>
+          <w:p>
+            <w:pPr>
+              <w:spacing w:before="20" w:after="20" w:line="240" w:lineRule="auto"/>
+              <w:jc w:val="center"/>
+            </w:pPr>
+            <w:r>
+              <w:rPr>
+                <w:rFonts w:ascii="Arial" w:hAnsi="Arial" w:eastAsia="Arial"/>
+                <w:b w:val="0"/>
+                <w:i w:val="0"/>
+                <w:sz w:val="16"/>
+              </w:rPr>
+              <w:t>07</w:t>
+            </w:r>
+          </w:p>
+        </w:tc>
+        <w:tc>
+          <w:tcPr>
+            <w:tcW w:type="dxa" w:w="907"/>
+            <w:vAlign w:val="center"/>
+          </w:tcPr>
+          <w:p>
+            <w:pPr>
+              <w:spacing w:before="20" w:after="20" w:line="240" w:lineRule="auto"/>
+              <w:jc w:val="center"/>
+            </w:pPr>
+            <w:r>
+              <w:rPr>
+                <w:rFonts w:ascii="Arial" w:hAnsi="Arial" w:eastAsia="Arial"/>
+                <w:b/>
+                <w:i w:val="0"/>
+                <w:color w:val="7B1E2B"/>
+                <w:sz w:val="16"/>
+              </w:rPr>
+              <w:t>DPL-19</w:t>
+            </w:r>
+          </w:p>
+        </w:tc>
+        <w:tc>
+          <w:tcPr>
+            <w:tcW w:type="dxa" w:w="6407"/>
+            <w:vAlign w:val="center"/>
+          </w:tcPr>
+          <w:p>
+            <w:pPr>
+              <w:spacing w:before="20" w:after="20" w:line="240" w:lineRule="auto"/>
+              <w:jc w:val="left"/>
+            </w:pPr>
+            <w:r>
+              <w:rPr>
+                <w:rFonts w:ascii="Arial" w:hAnsi="Arial" w:eastAsia="Arial"/>
+                <w:b/>
+                <w:i w:val="0"/>
+                <w:sz w:val="16"/>
+              </w:rPr>
+              <w:t>DETALLE MONTANTE - EDIF05</w:t>
+            </w:r>
+          </w:p>
+          <w:p>
+            <w:pPr>
+              <w:spacing w:before="0" w:after="20" w:line="240" w:lineRule="auto"/>
+              <w:jc w:val="left"/>
+            </w:pPr>
+            <w:r>
+              <w:rPr>
+                <w:rFonts w:ascii="Arial" w:hAnsi="Arial" w:eastAsia="Arial"/>
+                <w:b w:val="0"/>
+                <w:i w:val="0"/>
+                <w:color w:val="595959"/>
+                <w:sz w:val="13"/>
+              </w:rPr>
+              <w:t>CORTE B-B</w:t>
+            </w:r>
+          </w:p>
+        </w:tc>
+        <w:tc>
+          <w:tcPr>
+            <w:tcW w:type="dxa" w:w="1020"/>
+            <w:vAlign w:val="center"/>
+          </w:tcPr>
+          <w:p>
+            <w:pPr>
+              <w:spacing w:before="20" w:after="20" w:line="240" w:lineRule="auto"/>
+              <w:jc w:val="center"/>
+            </w:pPr>
+            <w:r>
+              <w:rPr>
+                <w:rFonts w:ascii="Arial" w:hAnsi="Arial" w:eastAsia="Arial"/>
+                <w:b w:val="0"/>
+                <w:i w:val="0"/>
+                <w:sz w:val="16"/>
+              </w:rPr>
+              <w:t>A1</w:t>
+            </w:r>
+          </w:p>
+        </w:tc>
+        <w:tc>
+          <w:tcPr>
+            <w:tcW w:type="dxa" w:w="1077"/>
+            <w:vAlign w:val="center"/>
+          </w:tcPr>
+          <w:p>
+            <w:pPr>
+              <w:spacing w:before="20" w:after="20" w:line="240" w:lineRule="auto"/>
+              <w:jc w:val="center"/>
+            </w:pPr>
+            <w:r>
+              <w:rPr>
+                <w:rFonts w:ascii="Arial" w:hAnsi="Arial" w:eastAsia="Arial"/>
+                <w:b w:val="0"/>
+                <w:i w:val="0"/>
+                <w:sz w:val="16"/>
+              </w:rPr>
+              <w:t>INDICADA</w:t>
+            </w:r>
+          </w:p>
+          <w:p>
+            <w:pPr>
+              <w:spacing w:before="0" w:after="20" w:line="240" w:lineRule="auto"/>
+              <w:jc w:val="center"/>
+            </w:pPr>
+            <w:r>
+              <w:rPr>
+                <w:rFonts w:ascii="Arial" w:hAnsi="Arial" w:eastAsia="Arial"/>
+                <w:b w:val="0"/>
+                <w:i w:val="0"/>
+                <w:color w:val="595959"/>
+                <w:sz w:val="13"/>
+              </w:rPr>
+              <w:t>1/60</w:t>
+            </w:r>
+          </w:p>
+        </w:tc>
+      </w:tr>
+      <w:tr>
+        <w:trPr>
+          <w:cantSplit/>
+        </w:trPr>
+        <w:tc>
+          <w:tcPr>
+            <w:tcW w:type="dxa" w:w="454"/>
+            <w:vAlign w:val="center"/>
+          </w:tcPr>
+          <w:p>
+            <w:pPr>
+              <w:spacing w:before="20" w:after="20" w:line="240" w:lineRule="auto"/>
+              <w:jc w:val="center"/>
+            </w:pPr>
+            <w:r>
+              <w:rPr>
+                <w:rFonts w:ascii="Arial" w:hAnsi="Arial" w:eastAsia="Arial"/>
+                <w:b w:val="0"/>
+                <w:i w:val="0"/>
+                <w:sz w:val="16"/>
+              </w:rPr>
+              <w:t>08</w:t>
+            </w:r>
+          </w:p>
+        </w:tc>
+        <w:tc>
+          <w:tcPr>
+            <w:tcW w:type="dxa" w:w="907"/>
+            <w:vAlign w:val="center"/>
+          </w:tcPr>
+          <w:p>
+            <w:pPr>
+              <w:spacing w:before="20" w:after="20" w:line="240" w:lineRule="auto"/>
+              <w:jc w:val="center"/>
+            </w:pPr>
+            <w:r>
+              <w:rPr>
+                <w:rFonts w:ascii="Arial" w:hAnsi="Arial" w:eastAsia="Arial"/>
+                <w:b/>
+                <w:i w:val="0"/>
+                <w:color w:val="7B1E2B"/>
+                <w:sz w:val="16"/>
+              </w:rPr>
+              <w:t>DPL-21</w:t>
+            </w:r>
+          </w:p>
+        </w:tc>
+        <w:tc>
+          <w:tcPr>
+            <w:tcW w:type="dxa" w:w="6407"/>
+            <w:vAlign w:val="center"/>
+          </w:tcPr>
+          <w:p>
+            <w:pPr>
+              <w:spacing w:before="20" w:after="20" w:line="240" w:lineRule="auto"/>
+              <w:jc w:val="left"/>
+            </w:pPr>
+            <w:r>
+              <w:rPr>
+                <w:rFonts w:ascii="Arial" w:hAnsi="Arial" w:eastAsia="Arial"/>
+                <w:b/>
+                <w:i w:val="0"/>
+                <w:sz w:val="16"/>
+              </w:rPr>
+              <w:t>DETALLE MONTANTE - EDIF07</w:t>
+            </w:r>
+          </w:p>
+          <w:p>
+            <w:pPr>
+              <w:spacing w:before="0" w:after="20" w:line="240" w:lineRule="auto"/>
+              <w:jc w:val="left"/>
+            </w:pPr>
+            <w:r>
+              <w:rPr>
+                <w:rFonts w:ascii="Arial" w:hAnsi="Arial" w:eastAsia="Arial"/>
+                <w:b w:val="0"/>
+                <w:i w:val="0"/>
+                <w:color w:val="595959"/>
+                <w:sz w:val="13"/>
+              </w:rPr>
+              <w:t>CORTE A-A</w:t>
+            </w:r>
+          </w:p>
+        </w:tc>
+        <w:tc>
+          <w:tcPr>
+            <w:tcW w:type="dxa" w:w="1020"/>
+            <w:vAlign w:val="center"/>
+          </w:tcPr>
+          <w:p>
+            <w:pPr>
+              <w:spacing w:before="20" w:after="20" w:line="240" w:lineRule="auto"/>
+              <w:jc w:val="center"/>
+            </w:pPr>
+            <w:r>
+              <w:rPr>
+                <w:rFonts w:ascii="Arial" w:hAnsi="Arial" w:eastAsia="Arial"/>
+                <w:b w:val="0"/>
+                <w:i w:val="0"/>
+                <w:sz w:val="16"/>
+              </w:rPr>
+              <w:t>A1</w:t>
+            </w:r>
+          </w:p>
+        </w:tc>
+        <w:tc>
+          <w:tcPr>
+            <w:tcW w:type="dxa" w:w="1077"/>
+            <w:vAlign w:val="center"/>
+          </w:tcPr>
+          <w:p>
+            <w:pPr>
+              <w:spacing w:before="20" w:after="20" w:line="240" w:lineRule="auto"/>
+              <w:jc w:val="center"/>
+            </w:pPr>
+            <w:r>
+              <w:rPr>
+                <w:rFonts w:ascii="Arial" w:hAnsi="Arial" w:eastAsia="Arial"/>
+                <w:b w:val="0"/>
+                <w:i w:val="0"/>
+                <w:sz w:val="16"/>
+              </w:rPr>
+              <w:t>INDICADA</w:t>
+            </w:r>
+          </w:p>
+          <w:p>
+            <w:pPr>
+              <w:spacing w:before="0" w:after="20" w:line="240" w:lineRule="auto"/>
+              <w:jc w:val="center"/>
+            </w:pPr>
+            <w:r>
+              <w:rPr>
+                <w:rFonts w:ascii="Arial" w:hAnsi="Arial" w:eastAsia="Arial"/>
+                <w:b w:val="0"/>
+                <w:i w:val="0"/>
+                <w:color w:val="595959"/>
+                <w:sz w:val="13"/>
+              </w:rPr>
+              <w:t>1/60</w:t>
+            </w:r>
+          </w:p>
+        </w:tc>
+      </w:tr>
+      <w:tr>
+        <w:trPr>
+          <w:cantSplit/>
+        </w:trPr>
+        <w:tc>
+          <w:tcPr>
+            <w:tcW w:type="dxa" w:w="454"/>
+            <w:vAlign w:val="center"/>
+          </w:tcPr>
+          <w:p>
+            <w:pPr>
+              <w:spacing w:before="20" w:after="20" w:line="240" w:lineRule="auto"/>
+              <w:jc w:val="center"/>
+            </w:pPr>
+            <w:r>
+              <w:rPr>
+                <w:rFonts w:ascii="Arial" w:hAnsi="Arial" w:eastAsia="Arial"/>
+                <w:b w:val="0"/>
+                <w:i w:val="0"/>
+                <w:sz w:val="16"/>
+              </w:rPr>
+              <w:t>09</w:t>
+            </w:r>
+          </w:p>
+        </w:tc>
+        <w:tc>
+          <w:tcPr>
+            <w:tcW w:type="dxa" w:w="907"/>
+            <w:vAlign w:val="center"/>
+          </w:tcPr>
+          <w:p>
+            <w:pPr>
+              <w:spacing w:before="20" w:after="20" w:line="240" w:lineRule="auto"/>
+              <w:jc w:val="center"/>
+            </w:pPr>
+            <w:r>
+              <w:rPr>
+                <w:rFonts w:ascii="Arial" w:hAnsi="Arial" w:eastAsia="Arial"/>
+                <w:b/>
+                <w:i w:val="0"/>
+                <w:color w:val="7B1E2B"/>
+                <w:sz w:val="16"/>
+              </w:rPr>
+              <w:t>DPL-24</w:t>
+            </w:r>
+          </w:p>
+        </w:tc>
+        <w:tc>
+          <w:tcPr>
+            <w:tcW w:type="dxa" w:w="6407"/>
+            <w:vAlign w:val="center"/>
+          </w:tcPr>
+          <w:p>
+            <w:pPr>
+              <w:spacing w:before="20" w:after="20" w:line="240" w:lineRule="auto"/>
+              <w:jc w:val="left"/>
+            </w:pPr>
+            <w:r>
+              <w:rPr>
+                <w:rFonts w:ascii="Arial" w:hAnsi="Arial" w:eastAsia="Arial"/>
+                <w:b/>
+                <w:i w:val="0"/>
+                <w:sz w:val="16"/>
+              </w:rPr>
+              <w:t>DETALLE DE REGISTRO DE LIMPIEZA - TAPA CIEGA DE CONCRETO ARMADO 0.68x0.68x0.08</w:t>
+            </w:r>
+          </w:p>
+        </w:tc>
+        <w:tc>
+          <w:tcPr>
+            <w:tcW w:type="dxa" w:w="1020"/>
+            <w:vAlign w:val="center"/>
+          </w:tcPr>
+          <w:p>
+            <w:pPr>
+              <w:spacing w:before="20" w:after="20" w:line="240" w:lineRule="auto"/>
+              <w:jc w:val="center"/>
+            </w:pPr>
+            <w:r>
+              <w:rPr>
+                <w:rFonts w:ascii="Arial" w:hAnsi="Arial" w:eastAsia="Arial"/>
+                <w:b w:val="0"/>
+                <w:i w:val="0"/>
+                <w:sz w:val="16"/>
+              </w:rPr>
+              <w:t>A1</w:t>
+            </w:r>
+          </w:p>
+        </w:tc>
+        <w:tc>
+          <w:tcPr>
+            <w:tcW w:type="dxa" w:w="1077"/>
+            <w:vAlign w:val="center"/>
+          </w:tcPr>
+          <w:p>
+            <w:pPr>
+              <w:spacing w:before="20" w:after="20" w:line="240" w:lineRule="auto"/>
+              <w:jc w:val="center"/>
+            </w:pPr>
+            <w:r>
+              <w:rPr>
+                <w:rFonts w:ascii="Arial" w:hAnsi="Arial" w:eastAsia="Arial"/>
+                <w:b w:val="0"/>
+                <w:i w:val="0"/>
+                <w:sz w:val="16"/>
+              </w:rPr>
+              <w:t>INDICADA</w:t>
+            </w:r>
+          </w:p>
+          <w:p>
+            <w:pPr>
+              <w:spacing w:before="0" w:after="20" w:line="240" w:lineRule="auto"/>
+              <w:jc w:val="center"/>
+            </w:pPr>
+            <w:r>
+              <w:rPr>
+                <w:rFonts w:ascii="Arial" w:hAnsi="Arial" w:eastAsia="Arial"/>
+                <w:b w:val="0"/>
+                <w:i w:val="0"/>
+                <w:color w:val="595959"/>
+                <w:sz w:val="13"/>
+              </w:rPr>
+              <w:t>1/5, 1/10, 1/11</w:t>
+            </w:r>
+          </w:p>
+        </w:tc>
+      </w:tr>
+      <w:tr>
+        <w:trPr>
+          <w:cantSplit/>
+        </w:trPr>
+        <w:tc>
+          <w:tcPr>
+            <w:tcW w:type="dxa" w:w="454"/>
+            <w:vAlign w:val="center"/>
+          </w:tcPr>
+          <w:p>
+            <w:pPr>
+              <w:spacing w:before="20" w:after="20" w:line="240" w:lineRule="auto"/>
+              <w:jc w:val="center"/>
+            </w:pPr>
+            <w:r>
+              <w:rPr>
+                <w:rFonts w:ascii="Arial" w:hAnsi="Arial" w:eastAsia="Arial"/>
+                <w:b w:val="0"/>
+                <w:i w:val="0"/>
+                <w:sz w:val="16"/>
+              </w:rPr>
+              <w:t>10</w:t>
+            </w:r>
+          </w:p>
+        </w:tc>
+        <w:tc>
+          <w:tcPr>
+            <w:tcW w:type="dxa" w:w="907"/>
+            <w:vAlign w:val="center"/>
+          </w:tcPr>
+          <w:p>
+            <w:pPr>
+              <w:spacing w:before="20" w:after="20" w:line="240" w:lineRule="auto"/>
+              <w:jc w:val="center"/>
+            </w:pPr>
+            <w:r>
+              <w:rPr>
+                <w:rFonts w:ascii="Arial" w:hAnsi="Arial" w:eastAsia="Arial"/>
+                <w:b/>
+                <w:i w:val="0"/>
+                <w:color w:val="7B1E2B"/>
+                <w:sz w:val="16"/>
+              </w:rPr>
+              <w:t>DPL-26</w:t>
+            </w:r>
+          </w:p>
+        </w:tc>
+        <w:tc>
+          <w:tcPr>
+            <w:tcW w:type="dxa" w:w="6407"/>
+            <w:vAlign w:val="center"/>
+          </w:tcPr>
+          <w:p>
+            <w:pPr>
+              <w:spacing w:before="20" w:after="20" w:line="240" w:lineRule="auto"/>
+              <w:jc w:val="left"/>
+            </w:pPr>
+            <w:r>
+              <w:rPr>
+                <w:rFonts w:ascii="Arial" w:hAnsi="Arial" w:eastAsia="Arial"/>
+                <w:b/>
+                <w:i w:val="0"/>
+                <w:sz w:val="16"/>
+              </w:rPr>
+              <w:t>CAJA DE LLEGADA (0+000) Y CAJA DE CAÍDA CON POZA DE DISIPACIÓN (ENTREGA AL CAR MUJERES)</w:t>
+            </w:r>
+          </w:p>
+        </w:tc>
+        <w:tc>
+          <w:tcPr>
+            <w:tcW w:type="dxa" w:w="1020"/>
+            <w:vAlign w:val="center"/>
+          </w:tcPr>
+          <w:p>
+            <w:pPr>
+              <w:spacing w:before="20" w:after="20" w:line="240" w:lineRule="auto"/>
+              <w:jc w:val="center"/>
+            </w:pPr>
+            <w:r>
+              <w:rPr>
+                <w:rFonts w:ascii="Arial" w:hAnsi="Arial" w:eastAsia="Arial"/>
+                <w:b w:val="0"/>
+                <w:i w:val="0"/>
+                <w:sz w:val="16"/>
+              </w:rPr>
+              <w:t>A1</w:t>
+            </w:r>
+          </w:p>
+        </w:tc>
+        <w:tc>
+          <w:tcPr>
+            <w:tcW w:type="dxa" w:w="1077"/>
+            <w:vAlign w:val="center"/>
+          </w:tcPr>
+          <w:p>
+            <w:pPr>
+              <w:spacing w:before="20" w:after="20" w:line="240" w:lineRule="auto"/>
+              <w:jc w:val="center"/>
+            </w:pPr>
+            <w:r>
+              <w:rPr>
+                <w:rFonts w:ascii="Arial" w:hAnsi="Arial" w:eastAsia="Arial"/>
+                <w:b w:val="0"/>
+                <w:i w:val="0"/>
+                <w:sz w:val="16"/>
+              </w:rPr>
+              <w:t>INDICADA</w:t>
+            </w:r>
+          </w:p>
+          <w:p>
+            <w:pPr>
+              <w:spacing w:before="0" w:after="20" w:line="240" w:lineRule="auto"/>
+              <w:jc w:val="center"/>
+            </w:pPr>
+            <w:r>
+              <w:rPr>
+                <w:rFonts w:ascii="Arial" w:hAnsi="Arial" w:eastAsia="Arial"/>
+                <w:b w:val="0"/>
+                <w:i w:val="0"/>
+                <w:color w:val="595959"/>
+                <w:sz w:val="13"/>
+              </w:rPr>
+              <w:t>1/25, 1/30</w:t>
+            </w:r>
+          </w:p>
+        </w:tc>
+      </w:tr>
+      <w:tr>
+        <w:trPr>
+          <w:cantSplit/>
+        </w:trPr>
+        <w:tc>
+          <w:tcPr>
+            <w:tcW w:type="dxa" w:w="454"/>
+            <w:vAlign w:val="center"/>
+          </w:tcPr>
+          <w:p>
+            <w:pPr>
+              <w:spacing w:before="20" w:after="20" w:line="240" w:lineRule="auto"/>
+              <w:jc w:val="center"/>
+            </w:pPr>
+            <w:r>
+              <w:rPr>
+                <w:rFonts w:ascii="Arial" w:hAnsi="Arial" w:eastAsia="Arial"/>
+                <w:b w:val="0"/>
+                <w:i w:val="0"/>
+                <w:sz w:val="16"/>
+              </w:rPr>
+              <w:t>11</w:t>
+            </w:r>
+          </w:p>
+        </w:tc>
+        <w:tc>
+          <w:tcPr>
+            <w:tcW w:type="dxa" w:w="907"/>
+            <w:vAlign w:val="center"/>
+          </w:tcPr>
+          <w:p>
+            <w:pPr>
+              <w:spacing w:before="20" w:after="20" w:line="240" w:lineRule="auto"/>
+              <w:jc w:val="center"/>
+            </w:pPr>
+            <w:r>
+              <w:rPr>
+                <w:rFonts w:ascii="Arial" w:hAnsi="Arial" w:eastAsia="Arial"/>
+                <w:b/>
+                <w:i w:val="0"/>
+                <w:color w:val="7B1E2B"/>
+                <w:sz w:val="16"/>
+              </w:rPr>
+              <w:t>DPL-36</w:t>
+            </w:r>
+          </w:p>
+        </w:tc>
+        <w:tc>
+          <w:tcPr>
+            <w:tcW w:type="dxa" w:w="6407"/>
+            <w:vAlign w:val="center"/>
+          </w:tcPr>
+          <w:p>
+            <w:pPr>
+              <w:spacing w:before="20" w:after="20" w:line="240" w:lineRule="auto"/>
+              <w:jc w:val="left"/>
+            </w:pPr>
+            <w:r>
+              <w:rPr>
+                <w:rFonts w:ascii="Arial" w:hAnsi="Arial" w:eastAsia="Arial"/>
+                <w:b/>
+                <w:i w:val="0"/>
+                <w:sz w:val="16"/>
+              </w:rPr>
+              <w:t>ISOMÉTRICO DE INSTALACIÓN DE LLORADEROS EN CUNETAS</w:t>
+            </w:r>
+          </w:p>
+        </w:tc>
+        <w:tc>
+          <w:tcPr>
+            <w:tcW w:type="dxa" w:w="1020"/>
+            <w:vAlign w:val="center"/>
+          </w:tcPr>
+          <w:p>
+            <w:pPr>
+              <w:spacing w:before="20" w:after="20" w:line="240" w:lineRule="auto"/>
+              <w:jc w:val="center"/>
+            </w:pPr>
+            <w:r>
+              <w:rPr>
+                <w:rFonts w:ascii="Arial" w:hAnsi="Arial" w:eastAsia="Arial"/>
+                <w:b w:val="0"/>
+                <w:i w:val="0"/>
+                <w:sz w:val="16"/>
+              </w:rPr>
+              <w:t>A1</w:t>
+            </w:r>
+          </w:p>
+        </w:tc>
+        <w:tc>
+          <w:tcPr>
+            <w:tcW w:type="dxa" w:w="1077"/>
+            <w:vAlign w:val="center"/>
+          </w:tcPr>
+          <w:p>
+            <w:pPr>
+              <w:spacing w:before="20" w:after="20" w:line="240" w:lineRule="auto"/>
+              <w:jc w:val="center"/>
+            </w:pPr>
+            <w:r>
+              <w:rPr>
+                <w:rFonts w:ascii="Arial" w:hAnsi="Arial" w:eastAsia="Arial"/>
+                <w:b w:val="0"/>
+                <w:i w:val="0"/>
+                <w:sz w:val="16"/>
+              </w:rPr>
+              <w:t>INDICADA</w:t>
+            </w:r>
+          </w:p>
+          <w:p>
+            <w:pPr>
+              <w:spacing w:before="0" w:after="20" w:line="240" w:lineRule="auto"/>
+              <w:jc w:val="center"/>
+            </w:pPr>
+            <w:r>
+              <w:rPr>
+                <w:rFonts w:ascii="Arial" w:hAnsi="Arial" w:eastAsia="Arial"/>
+                <w:b w:val="0"/>
+                <w:i w:val="0"/>
+                <w:color w:val="595959"/>
+                <w:sz w:val="13"/>
+              </w:rPr>
+              <w:t>1/10, 1/11</w:t>
+            </w:r>
+          </w:p>
+        </w:tc>
+      </w:tr>
+      <w:tr>
+        <w:trPr>
+          <w:cantSplit/>
+        </w:trPr>
+        <w:tc>
+          <w:tcPr>
+            <w:tcW w:type="dxa" w:w="9864"/>
+            <w:gridSpan w:val="5"/>
+            <w:shd w:val="clear" w:color="auto" w:fill="F2E6E8"/>
+            <w:vAlign w:val="center"/>
+          </w:tcPr>
+          <w:p>
+            <w:pPr>
+              <w:spacing w:before="20" w:after="20" w:line="240" w:lineRule="auto"/>
+              <w:jc w:val="left"/>
+            </w:pPr>
+            <w:r>
+              <w:rPr>
+                <w:rFonts w:ascii="Arial" w:hAnsi="Arial" w:eastAsia="Arial"/>
+                <w:b/>
+                <w:i w:val="0"/>
+                <w:color w:val="7B1E2B"/>
+                <w:sz w:val="15"/>
+              </w:rPr>
+              <w:t>LÁMINAS EN FORMATO A2  (23)</w:t>
+            </w:r>
+          </w:p>
+        </w:tc>
+      </w:tr>
+      <w:tr>
+        <w:trPr>
+          <w:cantSplit/>
+        </w:trPr>
+        <w:tc>
+          <w:tcPr>
+            <w:tcW w:type="dxa" w:w="454"/>
+            <w:vAlign w:val="center"/>
+          </w:tcPr>
+          <w:p>
+            <w:pPr>
+              <w:spacing w:before="20" w:after="20" w:line="240" w:lineRule="auto"/>
+              <w:jc w:val="center"/>
+            </w:pPr>
+            <w:r>
+              <w:rPr>
+                <w:rFonts w:ascii="Arial" w:hAnsi="Arial" w:eastAsia="Arial"/>
+                <w:b w:val="0"/>
+                <w:i w:val="0"/>
+                <w:sz w:val="16"/>
+              </w:rPr>
+              <w:t>12</w:t>
+            </w:r>
+          </w:p>
+        </w:tc>
+        <w:tc>
+          <w:tcPr>
+            <w:tcW w:type="dxa" w:w="907"/>
+            <w:vAlign w:val="center"/>
+          </w:tcPr>
+          <w:p>
+            <w:pPr>
+              <w:spacing w:before="20" w:after="20" w:line="240" w:lineRule="auto"/>
+              <w:jc w:val="center"/>
+            </w:pPr>
+            <w:r>
+              <w:rPr>
+                <w:rFonts w:ascii="Arial" w:hAnsi="Arial" w:eastAsia="Arial"/>
+                <w:b/>
+                <w:i w:val="0"/>
+                <w:color w:val="7B1E2B"/>
+                <w:sz w:val="16"/>
+              </w:rPr>
               <w:t>DPL-03</w:t>
             </w:r>
           </w:p>
@@ -682,7 +1946,7 @@
                 <w:i w:val="0"/>
                 <w:sz w:val="16"/>
               </w:rPr>
-              <w:t>04</w:t>
+              <w:t>13</w:t>
             </w:r>
           </w:p>
         </w:tc>
@@ -825,7 +2089,7 @@
                 <w:i w:val="0"/>
                 <w:sz w:val="16"/>
               </w:rPr>
-              <w:t>05</w:t>
+              <w:t>14</w:t>
             </w:r>
           </w:p>
         </w:tc>
@@ -950,36 +2214,6 @@
       <w:tr>
         <w:trPr>
           <w:cantSplit/>
-          <w:cantSplit/>
-        </w:trPr>
-        <w:tc>
-          <w:tcPr>
-            <w:tcW w:type="dxa" w:w="9864"/>
-            <w:gridSpan w:val="5"/>
-            <w:shd w:val="clear" w:color="auto" w:fill="F2E6E8"/>
-            <w:vAlign w:val="center"/>
-          </w:tcPr>
-          <w:p>
-            <w:pPr>
-              <w:spacing w:before="20" w:after="20" w:line="240" w:lineRule="auto"/>
-              <w:jc w:val="left"/>
-            </w:pPr>
-            <w:r>
-              <w:rPr>
-                <w:rFonts w:ascii="Arial" w:hAnsi="Arial" w:eastAsia="Arial"/>
-                <w:b/>
-                <w:i w:val="0"/>
-                <w:color w:val="7B1E2B"/>
-                <w:sz w:val="15"/>
-              </w:rPr>
-              <w:t>COLECTOR PLUVIAL FRONTAL  (DPL-06 A DPL-14)</w:t>
-            </w:r>
-          </w:p>
-        </w:tc>
-      </w:tr>
-      <w:tr>
-        <w:trPr>
-          <w:cantSplit/>
         </w:trPr>
         <w:tc>
           <w:tcPr>
@@ -998,277 +2232,7 @@
                 <w:i w:val="0"/>
                 <w:sz w:val="16"/>
               </w:rPr>
-              <w:t>06</w:t>
-            </w:r>
-          </w:p>
-        </w:tc>
-        <w:tc>
-          <w:tcPr>
-            <w:tcW w:type="dxa" w:w="907"/>
-            <w:vAlign w:val="center"/>
-          </w:tcPr>
-          <w:p>
-            <w:pPr>
-              <w:spacing w:before="20" w:after="20" w:line="240" w:lineRule="auto"/>
-              <w:jc w:val="center"/>
-            </w:pPr>
-            <w:r>
-              <w:rPr>
-                <w:rFonts w:ascii="Arial" w:hAnsi="Arial" w:eastAsia="Arial"/>
-                <w:b/>
-                <w:i w:val="0"/>
-                <w:color w:val="7B1E2B"/>
-                <w:sz w:val="16"/>
-              </w:rPr>
-              <w:t>DPL-06</w:t>
-            </w:r>
-          </w:p>
-        </w:tc>
-        <w:tc>
-          <w:tcPr>
-            <w:tcW w:type="dxa" w:w="6407"/>
-            <w:vAlign w:val="center"/>
-          </w:tcPr>
-          <w:p>
-            <w:pPr>
-              <w:spacing w:before="20" w:after="20" w:line="240" w:lineRule="auto"/>
-              <w:jc w:val="left"/>
-            </w:pPr>
-            <w:r>
-              <w:rPr>
-                <w:rFonts w:ascii="Arial" w:hAnsi="Arial" w:eastAsia="Arial"/>
-                <w:b/>
-                <w:i w:val="0"/>
-                <w:sz w:val="16"/>
-              </w:rPr>
-              <w:t>RED GENERAL COLECTOR PLUVIAL</w:t>
-            </w:r>
-          </w:p>
-        </w:tc>
-        <w:tc>
-          <w:tcPr>
-            <w:tcW w:type="dxa" w:w="1020"/>
-            <w:vAlign w:val="center"/>
-          </w:tcPr>
-          <w:p>
-            <w:pPr>
-              <w:spacing w:before="20" w:after="20" w:line="240" w:lineRule="auto"/>
-              <w:jc w:val="center"/>
-            </w:pPr>
-            <w:r>
-              <w:rPr>
-                <w:rFonts w:ascii="Arial" w:hAnsi="Arial" w:eastAsia="Arial"/>
-                <w:b w:val="0"/>
-                <w:i w:val="0"/>
-                <w:sz w:val="16"/>
-              </w:rPr>
-              <w:t>A0</w:t>
-            </w:r>
-          </w:p>
-        </w:tc>
-        <w:tc>
-          <w:tcPr>
-            <w:tcW w:type="dxa" w:w="1077"/>
-            <w:vAlign w:val="center"/>
-          </w:tcPr>
-          <w:p>
-            <w:pPr>
-              <w:spacing w:before="20" w:after="20" w:line="240" w:lineRule="auto"/>
-              <w:jc w:val="center"/>
-            </w:pPr>
-            <w:r>
-              <w:rPr>
-                <w:rFonts w:ascii="Arial" w:hAnsi="Arial" w:eastAsia="Arial"/>
-                <w:b w:val="0"/>
-                <w:i w:val="0"/>
-                <w:sz w:val="16"/>
-              </w:rPr>
-              <w:t>INDICADA</w:t>
-            </w:r>
-          </w:p>
-          <w:p>
-            <w:pPr>
-              <w:spacing w:before="0" w:after="20" w:line="240" w:lineRule="auto"/>
-              <w:jc w:val="center"/>
-            </w:pPr>
-            <w:r>
-              <w:rPr>
-                <w:rFonts w:ascii="Arial" w:hAnsi="Arial" w:eastAsia="Arial"/>
-                <w:b w:val="0"/>
-                <w:i w:val="0"/>
-                <w:color w:val="595959"/>
-                <w:sz w:val="13"/>
-              </w:rPr>
-              <w:t>1/130</w:t>
-            </w:r>
-          </w:p>
-        </w:tc>
-      </w:tr>
-      <w:tr>
-        <w:trPr>
-          <w:cantSplit/>
-        </w:trPr>
-        <w:tc>
-          <w:tcPr>
-            <w:tcW w:type="dxa" w:w="454"/>
-            <w:vAlign w:val="center"/>
-          </w:tcPr>
-          <w:p>
-            <w:pPr>
-              <w:spacing w:before="20" w:after="20" w:line="240" w:lineRule="auto"/>
-              <w:jc w:val="center"/>
-            </w:pPr>
-            <w:r>
-              <w:rPr>
-                <w:rFonts w:ascii="Arial" w:hAnsi="Arial" w:eastAsia="Arial"/>
-                <w:b w:val="0"/>
-                <w:i w:val="0"/>
-                <w:sz w:val="16"/>
-              </w:rPr>
-              <w:t>07</w:t>
-            </w:r>
-          </w:p>
-        </w:tc>
-        <w:tc>
-          <w:tcPr>
-            <w:tcW w:type="dxa" w:w="907"/>
-            <w:vAlign w:val="center"/>
-          </w:tcPr>
-          <w:p>
-            <w:pPr>
-              <w:spacing w:before="20" w:after="20" w:line="240" w:lineRule="auto"/>
-              <w:jc w:val="center"/>
-            </w:pPr>
-            <w:r>
-              <w:rPr>
-                <w:rFonts w:ascii="Arial" w:hAnsi="Arial" w:eastAsia="Arial"/>
-                <w:b/>
-                <w:i w:val="0"/>
-                <w:color w:val="7B1E2B"/>
-                <w:sz w:val="16"/>
-              </w:rPr>
-              <w:t>DPL-07</w:t>
-            </w:r>
-          </w:p>
-        </w:tc>
-        <w:tc>
-          <w:tcPr>
-            <w:tcW w:type="dxa" w:w="6407"/>
-            <w:vAlign w:val="center"/>
-          </w:tcPr>
-          <w:p>
-            <w:pPr>
-              <w:spacing w:before="20" w:after="20" w:line="240" w:lineRule="auto"/>
-              <w:jc w:val="left"/>
-            </w:pPr>
-            <w:r>
-              <w:rPr>
-                <w:rFonts w:ascii="Arial" w:hAnsi="Arial" w:eastAsia="Arial"/>
-                <w:b/>
-                <w:i w:val="0"/>
-                <w:sz w:val="16"/>
-              </w:rPr>
-              <w:t>PERFIL LONGITUDINAL GENERAL DEL COLECTOR</w:t>
-            </w:r>
-          </w:p>
-          <w:p>
-            <w:pPr>
-              <w:spacing w:before="0" w:after="20" w:line="240" w:lineRule="auto"/>
-              <w:jc w:val="left"/>
-            </w:pPr>
-            <w:r>
-              <w:rPr>
-                <w:rFonts w:ascii="Arial" w:hAnsi="Arial" w:eastAsia="Arial"/>
-                <w:b w:val="0"/>
-                <w:i w:val="0"/>
-                <w:color w:val="595959"/>
-                <w:sz w:val="13"/>
-              </w:rPr>
-              <w:t>PROGRESIVAS 0+000.00 A 0+073.39</w:t>
-            </w:r>
-          </w:p>
-        </w:tc>
-        <w:tc>
-          <w:tcPr>
-            <w:tcW w:type="dxa" w:w="1020"/>
-            <w:vAlign w:val="center"/>
-          </w:tcPr>
-          <w:p>
-            <w:pPr>
-              <w:spacing w:before="20" w:after="20" w:line="240" w:lineRule="auto"/>
-              <w:jc w:val="center"/>
-            </w:pPr>
-            <w:r>
-              <w:rPr>
-                <w:rFonts w:ascii="Arial" w:hAnsi="Arial" w:eastAsia="Arial"/>
-                <w:b w:val="0"/>
-                <w:i w:val="0"/>
-                <w:sz w:val="16"/>
-              </w:rPr>
-              <w:t>A1</w:t>
-            </w:r>
-          </w:p>
-        </w:tc>
-        <w:tc>
-          <w:tcPr>
-            <w:tcW w:type="dxa" w:w="1077"/>
-            <w:vAlign w:val="center"/>
-          </w:tcPr>
-          <w:p>
-            <w:pPr>
-              <w:spacing w:before="20" w:after="20" w:line="240" w:lineRule="auto"/>
-              <w:jc w:val="center"/>
-            </w:pPr>
-            <w:r>
-              <w:rPr>
-                <w:rFonts w:ascii="Arial" w:hAnsi="Arial" w:eastAsia="Arial"/>
-                <w:b w:val="0"/>
-                <w:i w:val="0"/>
-                <w:sz w:val="16"/>
-              </w:rPr>
-              <w:t>INDICADA</w:t>
-            </w:r>
-          </w:p>
-          <w:p>
-            <w:pPr>
-              <w:spacing w:before="0" w:after="20" w:line="240" w:lineRule="auto"/>
-              <w:jc w:val="center"/>
-            </w:pPr>
-            <w:r>
-              <w:rPr>
-                <w:rFonts w:ascii="Arial" w:hAnsi="Arial" w:eastAsia="Arial"/>
-                <w:b w:val="0"/>
-                <w:i w:val="0"/>
-                <w:color w:val="595959"/>
-                <w:sz w:val="13"/>
-              </w:rPr>
-              <w:t>1/55</w:t>
-            </w:r>
-          </w:p>
-        </w:tc>
-      </w:tr>
-      <w:tr>
-        <w:trPr>
-          <w:cantSplit/>
-        </w:trPr>
-        <w:tc>
-          <w:tcPr>
-            <w:tcW w:type="dxa" w:w="454"/>
-            <w:vAlign w:val="center"/>
-          </w:tcPr>
-          <w:p>
-            <w:pPr>
-              <w:spacing w:before="20" w:after="20" w:line="240" w:lineRule="auto"/>
-              <w:jc w:val="center"/>
-            </w:pPr>
-            <w:r>
-              <w:rPr>
-                <w:rFonts w:ascii="Arial" w:hAnsi="Arial" w:eastAsia="Arial"/>
-                <w:b w:val="0"/>
-                <w:i w:val="0"/>
-                <w:sz w:val="16"/>
-              </w:rPr>
-              <w:t>08</w:t>
+              <w:t>15</w:t>
             </w:r>
           </w:p>
         </w:tc>
@@ -1411,7 +2375,7 @@
                 <w:i w:val="0"/>
                 <w:sz w:val="16"/>
               </w:rPr>
-              <w:t>09</w:t>
+              <w:t>16</w:t>
             </w:r>
           </w:p>
         </w:tc>
@@ -1554,7 +2518,7 @@
                 <w:i w:val="0"/>
                 <w:sz w:val="16"/>
               </w:rPr>
-              <w:t>10</w:t>
+              <w:t>17</w:t>
             </w:r>
           </w:p>
         </w:tc>
@@ -1697,7 +2661,7 @@
                 <w:i w:val="0"/>
                 <w:sz w:val="16"/>
               </w:rPr>
-              <w:t>11</w:t>
+              <w:t>18</w:t>
             </w:r>
           </w:p>
         </w:tc>
@@ -1840,7 +2804,7 @@
                 <w:i w:val="0"/>
                 <w:sz w:val="16"/>
               </w:rPr>
-              <w:t>12</w:t>
+              <w:t>19</w:t>
             </w:r>
           </w:p>
         </w:tc>
@@ -1983,7 +2947,7 @@
                 <w:i w:val="0"/>
                 <w:sz w:val="16"/>
               </w:rPr>
-              <w:t>13</w:t>
+              <w:t>20</w:t>
             </w:r>
           </w:p>
         </w:tc>
@@ -2126,180 +3090,7 @@
                 <w:i w:val="0"/>
                 <w:sz w:val="16"/>
               </w:rPr>
-              <w:t>14</w:t>
-            </w:r>
-          </w:p>
-        </w:tc>
-        <w:tc>
-          <w:tcPr>
-            <w:tcW w:type="dxa" w:w="907"/>
-            <w:vAlign w:val="center"/>
-          </w:tcPr>
-          <w:p>
-            <w:pPr>
-              <w:spacing w:before="20" w:after="20" w:line="240" w:lineRule="auto"/>
-              <w:jc w:val="center"/>
-            </w:pPr>
-            <w:r>
-              <w:rPr>
-                <w:rFonts w:ascii="Arial" w:hAnsi="Arial" w:eastAsia="Arial"/>
-                <w:b/>
-                <w:i w:val="0"/>
-                <w:color w:val="7B1E2B"/>
-                <w:sz w:val="16"/>
-              </w:rPr>
-              <w:t>DPL-14</w:t>
-            </w:r>
-          </w:p>
-        </w:tc>
-        <w:tc>
-          <w:tcPr>
-            <w:tcW w:type="dxa" w:w="6407"/>
-            <w:vAlign w:val="center"/>
-          </w:tcPr>
-          <w:p>
-            <w:pPr>
-              <w:spacing w:before="20" w:after="20" w:line="240" w:lineRule="auto"/>
-              <w:jc w:val="left"/>
-            </w:pPr>
-            <w:r>
-              <w:rPr>
-                <w:rFonts w:ascii="Arial" w:hAnsi="Arial" w:eastAsia="Arial"/>
-                <w:b/>
-                <w:i w:val="0"/>
-                <w:sz w:val="16"/>
-              </w:rPr>
-              <w:t>ISOMÉTRICOS DE LAS SECCIONES TRANSVERSALES</w:t>
-            </w:r>
-          </w:p>
-          <w:p>
-            <w:pPr>
-              <w:spacing w:before="0" w:after="20" w:line="240" w:lineRule="auto"/>
-              <w:jc w:val="left"/>
-            </w:pPr>
-            <w:r>
-              <w:rPr>
-                <w:rFonts w:ascii="Arial" w:hAnsi="Arial" w:eastAsia="Arial"/>
-                <w:b w:val="0"/>
-                <w:i w:val="0"/>
-                <w:color w:val="595959"/>
-                <w:sz w:val="13"/>
-              </w:rPr>
-              <w:t>SECCIONES TÍPICAS: TRAMO NORMAL (0+010.00), CRUCE DE MOTOS (0+040.00) Y CRUCE DE CAMIONES (0+028.80)</w:t>
-            </w:r>
-          </w:p>
-        </w:tc>
-        <w:tc>
-          <w:tcPr>
-            <w:tcW w:type="dxa" w:w="1020"/>
-            <w:vAlign w:val="center"/>
-          </w:tcPr>
-          <w:p>
-            <w:pPr>
-              <w:spacing w:before="20" w:after="20" w:line="240" w:lineRule="auto"/>
-              <w:jc w:val="center"/>
-            </w:pPr>
-            <w:r>
-              <w:rPr>
-                <w:rFonts w:ascii="Arial" w:hAnsi="Arial" w:eastAsia="Arial"/>
-                <w:b w:val="0"/>
-                <w:i w:val="0"/>
-                <w:sz w:val="16"/>
-              </w:rPr>
-              <w:t>A3</w:t>
-            </w:r>
-          </w:p>
-        </w:tc>
-        <w:tc>
-          <w:tcPr>
-            <w:tcW w:type="dxa" w:w="1077"/>
-            <w:vAlign w:val="center"/>
-          </w:tcPr>
-          <w:p>
-            <w:pPr>
-              <w:spacing w:before="20" w:after="20" w:line="240" w:lineRule="auto"/>
-              <w:jc w:val="center"/>
-            </w:pPr>
-            <w:r>
-              <w:rPr>
-                <w:rFonts w:ascii="Arial" w:hAnsi="Arial" w:eastAsia="Arial"/>
-                <w:b w:val="0"/>
-                <w:i w:val="0"/>
-                <w:sz w:val="16"/>
-              </w:rPr>
-              <w:t>INDICADA</w:t>
-            </w:r>
-          </w:p>
-          <w:p>
-            <w:pPr>
-              <w:spacing w:before="0" w:after="20" w:line="240" w:lineRule="auto"/>
-              <w:jc w:val="center"/>
-            </w:pPr>
-            <w:r>
-              <w:rPr>
-                <w:rFonts w:ascii="Arial" w:hAnsi="Arial" w:eastAsia="Arial"/>
-                <w:b w:val="0"/>
-                <w:i w:val="0"/>
-                <w:color w:val="595959"/>
-                <w:sz w:val="13"/>
-              </w:rPr>
-              <w:t>1/10, 1/20</w:t>
-            </w:r>
-          </w:p>
-        </w:tc>
-      </w:tr>
-      <w:tr>
-        <w:trPr>
-          <w:cantSplit/>
-          <w:cantSplit/>
-        </w:trPr>
-        <w:tc>
-          <w:tcPr>
-            <w:tcW w:type="dxa" w:w="9864"/>
-            <w:gridSpan w:val="5"/>
-            <w:shd w:val="clear" w:color="auto" w:fill="F2E6E8"/>
-            <w:vAlign w:val="center"/>
-          </w:tcPr>
-          <w:p>
-            <w:pPr>
-              <w:spacing w:before="20" w:after="20" w:line="240" w:lineRule="auto"/>
-              <w:jc w:val="left"/>
-            </w:pPr>
-            <w:r>
-              <w:rPr>
-                <w:rFonts w:ascii="Arial" w:hAnsi="Arial" w:eastAsia="Arial"/>
-                <w:b/>
-                <w:i w:val="0"/>
-                <w:color w:val="7B1E2B"/>
-                <w:sz w:val="15"/>
-              </w:rPr>
-              <w:t>MONTANTES PLUVIALES POR EDIFICACIÓN  (DPL-15 A DPL-23)</w:t>
-            </w:r>
-          </w:p>
-        </w:tc>
-      </w:tr>
-      <w:tr>
-        <w:trPr>
-          <w:cantSplit/>
-        </w:trPr>
-        <w:tc>
-          <w:tcPr>
-            <w:tcW w:type="dxa" w:w="454"/>
-            <w:vAlign w:val="center"/>
-          </w:tcPr>
-          <w:p>
-            <w:pPr>
-              <w:spacing w:before="20" w:after="20" w:line="240" w:lineRule="auto"/>
-              <w:jc w:val="center"/>
-            </w:pPr>
-            <w:r>
-              <w:rPr>
-                <w:rFonts w:ascii="Arial" w:hAnsi="Arial" w:eastAsia="Arial"/>
-                <w:b w:val="0"/>
-                <w:i w:val="0"/>
-                <w:sz w:val="16"/>
-              </w:rPr>
-              <w:t>15</w:t>
+              <w:t>21</w:t>
             </w:r>
           </w:p>
         </w:tc>
@@ -2442,7 +3233,7 @@
                 <w:i w:val="0"/>
                 <w:sz w:val="16"/>
               </w:rPr>
-              <w:t>16</w:t>
+              <w:t>22</w:t>
             </w:r>
           </w:p>
         </w:tc>
@@ -2585,7 +3376,7 @@
                 <w:i w:val="0"/>
                 <w:sz w:val="16"/>
               </w:rPr>
-              <w:t>17</w:t>
+              <w:t>23</w:t>
             </w:r>
           </w:p>
         </w:tc>
@@ -2728,293 +3519,7 @@
                 <w:i w:val="0"/>
                 <w:sz w:val="16"/>
               </w:rPr>
-              <w:t>18</w:t>
-            </w:r>
-          </w:p>
-        </w:tc>
-        <w:tc>
-          <w:tcPr>
-            <w:tcW w:type="dxa" w:w="907"/>
-            <w:vAlign w:val="center"/>
-          </w:tcPr>
-          <w:p>
-            <w:pPr>
-              <w:spacing w:before="20" w:after="20" w:line="240" w:lineRule="auto"/>
-              <w:jc w:val="center"/>
-            </w:pPr>
-            <w:r>
-              <w:rPr>
-                <w:rFonts w:ascii="Arial" w:hAnsi="Arial" w:eastAsia="Arial"/>
-                <w:b/>
-                <w:i w:val="0"/>
-                <w:color w:val="7B1E2B"/>
-                <w:sz w:val="16"/>
-              </w:rPr>
-              <w:t>DPL-18</w:t>
-            </w:r>
-          </w:p>
-        </w:tc>
-        <w:tc>
-          <w:tcPr>
-            <w:tcW w:type="dxa" w:w="6407"/>
-            <w:vAlign w:val="center"/>
-          </w:tcPr>
-          <w:p>
-            <w:pPr>
-              <w:spacing w:before="20" w:after="20" w:line="240" w:lineRule="auto"/>
-              <w:jc w:val="left"/>
-            </w:pPr>
-            <w:r>
-              <w:rPr>
-                <w:rFonts w:ascii="Arial" w:hAnsi="Arial" w:eastAsia="Arial"/>
-                <w:b/>
-                <w:i w:val="0"/>
-                <w:sz w:val="16"/>
-              </w:rPr>
-              <w:t>DETALLE MONTANTE - EDIF04</w:t>
-            </w:r>
-          </w:p>
-          <w:p>
-            <w:pPr>
-              <w:spacing w:before="0" w:after="20" w:line="240" w:lineRule="auto"/>
-              <w:jc w:val="left"/>
-            </w:pPr>
-            <w:r>
-              <w:rPr>
-                <w:rFonts w:ascii="Arial" w:hAnsi="Arial" w:eastAsia="Arial"/>
-                <w:b w:val="0"/>
-                <w:i w:val="0"/>
-                <w:color w:val="595959"/>
-                <w:sz w:val="13"/>
-              </w:rPr>
-              <w:t>CORTE A-A</w:t>
-            </w:r>
-          </w:p>
-        </w:tc>
-        <w:tc>
-          <w:tcPr>
-            <w:tcW w:type="dxa" w:w="1020"/>
-            <w:vAlign w:val="center"/>
-          </w:tcPr>
-          <w:p>
-            <w:pPr>
-              <w:spacing w:before="20" w:after="20" w:line="240" w:lineRule="auto"/>
-              <w:jc w:val="center"/>
-            </w:pPr>
-            <w:r>
-              <w:rPr>
-                <w:rFonts w:ascii="Arial" w:hAnsi="Arial" w:eastAsia="Arial"/>
-                <w:b w:val="0"/>
-                <w:i w:val="0"/>
-                <w:sz w:val="16"/>
-              </w:rPr>
-              <w:t>A1</w:t>
-            </w:r>
-          </w:p>
-        </w:tc>
-        <w:tc>
-          <w:tcPr>
-            <w:tcW w:type="dxa" w:w="1077"/>
-            <w:vAlign w:val="center"/>
-          </w:tcPr>
-          <w:p>
-            <w:pPr>
-              <w:spacing w:before="20" w:after="20" w:line="240" w:lineRule="auto"/>
-              <w:jc w:val="center"/>
-            </w:pPr>
-            <w:r>
-              <w:rPr>
-                <w:rFonts w:ascii="Arial" w:hAnsi="Arial" w:eastAsia="Arial"/>
-                <w:b w:val="0"/>
-                <w:i w:val="0"/>
-                <w:sz w:val="16"/>
-              </w:rPr>
-              <w:t>INDICADA</w:t>
-            </w:r>
-          </w:p>
-          <w:p>
-            <w:pPr>
-              <w:spacing w:before="0" w:after="20" w:line="240" w:lineRule="auto"/>
-              <w:jc w:val="center"/>
-            </w:pPr>
-            <w:r>
-              <w:rPr>
-                <w:rFonts w:ascii="Arial" w:hAnsi="Arial" w:eastAsia="Arial"/>
-                <w:b w:val="0"/>
-                <w:i w:val="0"/>
-                <w:color w:val="595959"/>
-                <w:sz w:val="13"/>
-              </w:rPr>
-              <w:t>1/70</w:t>
-            </w:r>
-          </w:p>
-        </w:tc>
-      </w:tr>
-      <w:tr>
-        <w:trPr>
-          <w:cantSplit/>
-        </w:trPr>
-        <w:tc>
-          <w:tcPr>
-            <w:tcW w:type="dxa" w:w="454"/>
-            <w:vAlign w:val="center"/>
-          </w:tcPr>
-          <w:p>
-            <w:pPr>
-              <w:spacing w:before="20" w:after="20" w:line="240" w:lineRule="auto"/>
-              <w:jc w:val="center"/>
-            </w:pPr>
-            <w:r>
-              <w:rPr>
-                <w:rFonts w:ascii="Arial" w:hAnsi="Arial" w:eastAsia="Arial"/>
-                <w:b w:val="0"/>
-                <w:i w:val="0"/>
-                <w:sz w:val="16"/>
-              </w:rPr>
-              <w:t>19</w:t>
-            </w:r>
-          </w:p>
-        </w:tc>
-        <w:tc>
-          <w:tcPr>
-            <w:tcW w:type="dxa" w:w="907"/>
-            <w:vAlign w:val="center"/>
-          </w:tcPr>
-          <w:p>
-            <w:pPr>
-              <w:spacing w:before="20" w:after="20" w:line="240" w:lineRule="auto"/>
-              <w:jc w:val="center"/>
-            </w:pPr>
-            <w:r>
-              <w:rPr>
-                <w:rFonts w:ascii="Arial" w:hAnsi="Arial" w:eastAsia="Arial"/>
-                <w:b/>
-                <w:i w:val="0"/>
-                <w:color w:val="7B1E2B"/>
-                <w:sz w:val="16"/>
-              </w:rPr>
-              <w:t>DPL-19</w:t>
-            </w:r>
-          </w:p>
-        </w:tc>
-        <w:tc>
-          <w:tcPr>
-            <w:tcW w:type="dxa" w:w="6407"/>
-            <w:vAlign w:val="center"/>
-          </w:tcPr>
-          <w:p>
-            <w:pPr>
-              <w:spacing w:before="20" w:after="20" w:line="240" w:lineRule="auto"/>
-              <w:jc w:val="left"/>
-            </w:pPr>
-            <w:r>
-              <w:rPr>
-                <w:rFonts w:ascii="Arial" w:hAnsi="Arial" w:eastAsia="Arial"/>
-                <w:b/>
-                <w:i w:val="0"/>
-                <w:sz w:val="16"/>
-              </w:rPr>
-              <w:t>DETALLE MONTANTE - EDIF05</w:t>
-            </w:r>
-          </w:p>
-          <w:p>
-            <w:pPr>
-              <w:spacing w:before="0" w:after="20" w:line="240" w:lineRule="auto"/>
-              <w:jc w:val="left"/>
-            </w:pPr>
-            <w:r>
-              <w:rPr>
-                <w:rFonts w:ascii="Arial" w:hAnsi="Arial" w:eastAsia="Arial"/>
-                <w:b w:val="0"/>
-                <w:i w:val="0"/>
-                <w:color w:val="595959"/>
-                <w:sz w:val="13"/>
-              </w:rPr>
-              <w:t>CORTE B-B</w:t>
-            </w:r>
-          </w:p>
-        </w:tc>
-        <w:tc>
-          <w:tcPr>
-            <w:tcW w:type="dxa" w:w="1020"/>
-            <w:vAlign w:val="center"/>
-          </w:tcPr>
-          <w:p>
-            <w:pPr>
-              <w:spacing w:before="20" w:after="20" w:line="240" w:lineRule="auto"/>
-              <w:jc w:val="center"/>
-            </w:pPr>
-            <w:r>
-              <w:rPr>
-                <w:rFonts w:ascii="Arial" w:hAnsi="Arial" w:eastAsia="Arial"/>
-                <w:b w:val="0"/>
-                <w:i w:val="0"/>
-                <w:sz w:val="16"/>
-              </w:rPr>
-              <w:t>A1</w:t>
-            </w:r>
-          </w:p>
-        </w:tc>
-        <w:tc>
-          <w:tcPr>
-            <w:tcW w:type="dxa" w:w="1077"/>
-            <w:vAlign w:val="center"/>
-          </w:tcPr>
-          <w:p>
-            <w:pPr>
-              <w:spacing w:before="20" w:after="20" w:line="240" w:lineRule="auto"/>
-              <w:jc w:val="center"/>
-            </w:pPr>
-            <w:r>
-              <w:rPr>
-                <w:rFonts w:ascii="Arial" w:hAnsi="Arial" w:eastAsia="Arial"/>
-                <w:b w:val="0"/>
-                <w:i w:val="0"/>
-                <w:sz w:val="16"/>
-              </w:rPr>
-              <w:t>INDICADA</w:t>
-            </w:r>
-          </w:p>
-          <w:p>
-            <w:pPr>
-              <w:spacing w:before="0" w:after="20" w:line="240" w:lineRule="auto"/>
-              <w:jc w:val="center"/>
-            </w:pPr>
-            <w:r>
-              <w:rPr>
-                <w:rFonts w:ascii="Arial" w:hAnsi="Arial" w:eastAsia="Arial"/>
-                <w:b w:val="0"/>
-                <w:i w:val="0"/>
-                <w:color w:val="595959"/>
-                <w:sz w:val="13"/>
-              </w:rPr>
-              <w:t>1/60</w:t>
-            </w:r>
-          </w:p>
-        </w:tc>
-      </w:tr>
-      <w:tr>
-        <w:trPr>
-          <w:cantSplit/>
-        </w:trPr>
-        <w:tc>
-          <w:tcPr>
-            <w:tcW w:type="dxa" w:w="454"/>
-            <w:vAlign w:val="center"/>
-          </w:tcPr>
-          <w:p>
-            <w:pPr>
-              <w:spacing w:before="20" w:after="20" w:line="240" w:lineRule="auto"/>
-              <w:jc w:val="center"/>
-            </w:pPr>
-            <w:r>
-              <w:rPr>
-                <w:rFonts w:ascii="Arial" w:hAnsi="Arial" w:eastAsia="Arial"/>
-                <w:b w:val="0"/>
-                <w:i w:val="0"/>
-                <w:sz w:val="16"/>
-              </w:rPr>
-              <w:t>20</w:t>
+              <w:t>24</w:t>
             </w:r>
           </w:p>
         </w:tc>
@@ -3157,150 +3662,7 @@
                 <w:i w:val="0"/>
                 <w:sz w:val="16"/>
               </w:rPr>
-              <w:t>21</w:t>
-            </w:r>
-          </w:p>
-        </w:tc>
-        <w:tc>
-          <w:tcPr>
-            <w:tcW w:type="dxa" w:w="907"/>
-            <w:vAlign w:val="center"/>
-          </w:tcPr>
-          <w:p>
-            <w:pPr>
-              <w:spacing w:before="20" w:after="20" w:line="240" w:lineRule="auto"/>
-              <w:jc w:val="center"/>
-            </w:pPr>
-            <w:r>
-              <w:rPr>
-                <w:rFonts w:ascii="Arial" w:hAnsi="Arial" w:eastAsia="Arial"/>
-                <w:b/>
-                <w:i w:val="0"/>
-                <w:color w:val="7B1E2B"/>
-                <w:sz w:val="16"/>
-              </w:rPr>
-              <w:t>DPL-21</w:t>
-            </w:r>
-          </w:p>
-        </w:tc>
-        <w:tc>
-          <w:tcPr>
-            <w:tcW w:type="dxa" w:w="6407"/>
-            <w:vAlign w:val="center"/>
-          </w:tcPr>
-          <w:p>
-            <w:pPr>
-              <w:spacing w:before="20" w:after="20" w:line="240" w:lineRule="auto"/>
-              <w:jc w:val="left"/>
-            </w:pPr>
-            <w:r>
-              <w:rPr>
-                <w:rFonts w:ascii="Arial" w:hAnsi="Arial" w:eastAsia="Arial"/>
-                <w:b/>
-                <w:i w:val="0"/>
-                <w:sz w:val="16"/>
-              </w:rPr>
-              <w:t>DETALLE MONTANTE - EDIF07</w:t>
-            </w:r>
-          </w:p>
-          <w:p>
-            <w:pPr>
-              <w:spacing w:before="0" w:after="20" w:line="240" w:lineRule="auto"/>
-              <w:jc w:val="left"/>
-            </w:pPr>
-            <w:r>
-              <w:rPr>
-                <w:rFonts w:ascii="Arial" w:hAnsi="Arial" w:eastAsia="Arial"/>
-                <w:b w:val="0"/>
-                <w:i w:val="0"/>
-                <w:color w:val="595959"/>
-                <w:sz w:val="13"/>
-              </w:rPr>
-              <w:t>CORTE A-A</w:t>
-            </w:r>
-          </w:p>
-        </w:tc>
-        <w:tc>
-          <w:tcPr>
-            <w:tcW w:type="dxa" w:w="1020"/>
-            <w:vAlign w:val="center"/>
-          </w:tcPr>
-          <w:p>
-            <w:pPr>
-              <w:spacing w:before="20" w:after="20" w:line="240" w:lineRule="auto"/>
-              <w:jc w:val="center"/>
-            </w:pPr>
-            <w:r>
-              <w:rPr>
-                <w:rFonts w:ascii="Arial" w:hAnsi="Arial" w:eastAsia="Arial"/>
-                <w:b w:val="0"/>
-                <w:i w:val="0"/>
-                <w:sz w:val="16"/>
-              </w:rPr>
-              <w:t>A1</w:t>
-            </w:r>
-          </w:p>
-        </w:tc>
-        <w:tc>
-          <w:tcPr>
-            <w:tcW w:type="dxa" w:w="1077"/>
-            <w:vAlign w:val="center"/>
-          </w:tcPr>
-          <w:p>
-            <w:pPr>
-              <w:spacing w:before="20" w:after="20" w:line="240" w:lineRule="auto"/>
-              <w:jc w:val="center"/>
-            </w:pPr>
-            <w:r>
-              <w:rPr>
-                <w:rFonts w:ascii="Arial" w:hAnsi="Arial" w:eastAsia="Arial"/>
-                <w:b w:val="0"/>
-                <w:i w:val="0"/>
-                <w:sz w:val="16"/>
-              </w:rPr>
-              <w:t>INDICADA</w:t>
-            </w:r>
-          </w:p>
-          <w:p>
-            <w:pPr>
-              <w:spacing w:before="0" w:after="20" w:line="240" w:lineRule="auto"/>
-              <w:jc w:val="center"/>
-            </w:pPr>
-            <w:r>
-              <w:rPr>
-                <w:rFonts w:ascii="Arial" w:hAnsi="Arial" w:eastAsia="Arial"/>
-                <w:b w:val="0"/>
-                <w:i w:val="0"/>
-                <w:color w:val="595959"/>
-                <w:sz w:val="13"/>
-              </w:rPr>
-              <w:t>1/60</w:t>
-            </w:r>
-          </w:p>
-        </w:tc>
-      </w:tr>
-      <w:tr>
-        <w:trPr>
-          <w:cantSplit/>
-        </w:trPr>
-        <w:tc>
-          <w:tcPr>
-            <w:tcW w:type="dxa" w:w="454"/>
-            <w:vAlign w:val="center"/>
-          </w:tcPr>
-          <w:p>
-            <w:pPr>
-              <w:spacing w:before="20" w:after="20" w:line="240" w:lineRule="auto"/>
-              <w:jc w:val="center"/>
-            </w:pPr>
-            <w:r>
-              <w:rPr>
-                <w:rFonts w:ascii="Arial" w:hAnsi="Arial" w:eastAsia="Arial"/>
-                <w:b w:val="0"/>
-                <w:i w:val="0"/>
-                <w:sz w:val="16"/>
-              </w:rPr>
-              <w:t>22</w:t>
+              <w:t>25</w:t>
             </w:r>
           </w:p>
         </w:tc>
@@ -3443,7 +3805,7 @@
                 <w:i w:val="0"/>
                 <w:sz w:val="16"/>
               </w:rPr>
-              <w:t>23</w:t>
+              <w:t>26</w:t>
             </w:r>
           </w:p>
         </w:tc>
@@ -3568,36 +3930,6 @@
       <w:tr>
         <w:trPr>
           <w:cantSplit/>
-          <w:cantSplit/>
-        </w:trPr>
-        <w:tc>
-          <w:tcPr>
-            <w:tcW w:type="dxa" w:w="9864"/>
-            <w:gridSpan w:val="5"/>
-            <w:shd w:val="clear" w:color="auto" w:fill="F2E6E8"/>
-            <w:vAlign w:val="center"/>
-          </w:tcPr>
-          <w:p>
-            <w:pPr>
-              <w:spacing w:before="20" w:after="20" w:line="240" w:lineRule="auto"/>
-              <w:jc w:val="left"/>
-            </w:pPr>
-            <w:r>
-              <w:rPr>
-                <w:rFonts w:ascii="Arial" w:hAnsi="Arial" w:eastAsia="Arial"/>
-                <w:b/>
-                <w:i w:val="0"/>
-                <w:color w:val="7B1E2B"/>
-                <w:sz w:val="15"/>
-              </w:rPr>
-              <w:t>DETALLES DEL COLECTOR: REGISTROS, EMPALMES, CAJAS Y JUNTAS  (DPL-24 A DPL-29)</w:t>
-            </w:r>
-          </w:p>
-        </w:tc>
-      </w:tr>
-      <w:tr>
-        <w:trPr>
-          <w:cantSplit/>
         </w:trPr>
         <w:tc>
           <w:tcPr>
@@ -3616,134 +3948,7 @@
                 <w:i w:val="0"/>
                 <w:sz w:val="16"/>
               </w:rPr>
-              <w:t>24</w:t>
-            </w:r>
-          </w:p>
-        </w:tc>
-        <w:tc>
-          <w:tcPr>
-            <w:tcW w:type="dxa" w:w="907"/>
-            <w:vAlign w:val="center"/>
-          </w:tcPr>
-          <w:p>
-            <w:pPr>
-              <w:spacing w:before="20" w:after="20" w:line="240" w:lineRule="auto"/>
-              <w:jc w:val="center"/>
-            </w:pPr>
-            <w:r>
-              <w:rPr>
-                <w:rFonts w:ascii="Arial" w:hAnsi="Arial" w:eastAsia="Arial"/>
-                <w:b/>
-                <w:i w:val="0"/>
-                <w:color w:val="7B1E2B"/>
-                <w:sz w:val="16"/>
-              </w:rPr>
-              <w:t>DPL-24</w:t>
-            </w:r>
-          </w:p>
-        </w:tc>
-        <w:tc>
-          <w:tcPr>
-            <w:tcW w:type="dxa" w:w="6407"/>
-            <w:vAlign w:val="center"/>
-          </w:tcPr>
-          <w:p>
-            <w:pPr>
-              <w:spacing w:before="20" w:after="20" w:line="240" w:lineRule="auto"/>
-              <w:jc w:val="left"/>
-            </w:pPr>
-            <w:r>
-              <w:rPr>
-                <w:rFonts w:ascii="Arial" w:hAnsi="Arial" w:eastAsia="Arial"/>
-                <w:b/>
-                <w:i w:val="0"/>
-                <w:sz w:val="16"/>
-              </w:rPr>
-              <w:t>DETALLE DE REGISTRO DE LIMPIEZA - TAPA CIEGA DE CONCRETO ARMADO 0.68x0.68x0.08</w:t>
-            </w:r>
-          </w:p>
-        </w:tc>
-        <w:tc>
-          <w:tcPr>
-            <w:tcW w:type="dxa" w:w="1020"/>
-            <w:vAlign w:val="center"/>
-          </w:tcPr>
-          <w:p>
-            <w:pPr>
-              <w:spacing w:before="20" w:after="20" w:line="240" w:lineRule="auto"/>
-              <w:jc w:val="center"/>
-            </w:pPr>
-            <w:r>
-              <w:rPr>
-                <w:rFonts w:ascii="Arial" w:hAnsi="Arial" w:eastAsia="Arial"/>
-                <w:b w:val="0"/>
-                <w:i w:val="0"/>
-                <w:sz w:val="16"/>
-              </w:rPr>
-              <w:t>A1</w:t>
-            </w:r>
-          </w:p>
-        </w:tc>
-        <w:tc>
-          <w:tcPr>
-            <w:tcW w:type="dxa" w:w="1077"/>
-            <w:vAlign w:val="center"/>
-          </w:tcPr>
-          <w:p>
-            <w:pPr>
-              <w:spacing w:before="20" w:after="20" w:line="240" w:lineRule="auto"/>
-              <w:jc w:val="center"/>
-            </w:pPr>
-            <w:r>
-              <w:rPr>
-                <w:rFonts w:ascii="Arial" w:hAnsi="Arial" w:eastAsia="Arial"/>
-                <w:b w:val="0"/>
-                <w:i w:val="0"/>
-                <w:sz w:val="16"/>
-              </w:rPr>
-              <w:t>INDICADA</w:t>
-            </w:r>
-          </w:p>
-          <w:p>
-            <w:pPr>
-              <w:spacing w:before="0" w:after="20" w:line="240" w:lineRule="auto"/>
-              <w:jc w:val="center"/>
-            </w:pPr>
-            <w:r>
-              <w:rPr>
-                <w:rFonts w:ascii="Arial" w:hAnsi="Arial" w:eastAsia="Arial"/>
-                <w:b w:val="0"/>
-                <w:i w:val="0"/>
-                <w:color w:val="595959"/>
-                <w:sz w:val="13"/>
-              </w:rPr>
-              <w:t>1/5, 1/10, 1/11</w:t>
-            </w:r>
-          </w:p>
-        </w:tc>
-      </w:tr>
-      <w:tr>
-        <w:trPr>
-          <w:cantSplit/>
-        </w:trPr>
-        <w:tc>
-          <w:tcPr>
-            <w:tcW w:type="dxa" w:w="454"/>
-            <w:vAlign w:val="center"/>
-          </w:tcPr>
-          <w:p>
-            <w:pPr>
-              <w:spacing w:before="20" w:after="20" w:line="240" w:lineRule="auto"/>
-              <w:jc w:val="center"/>
-            </w:pPr>
-            <w:r>
-              <w:rPr>
-                <w:rFonts w:ascii="Arial" w:hAnsi="Arial" w:eastAsia="Arial"/>
-                <w:b w:val="0"/>
-                <w:i w:val="0"/>
-                <w:sz w:val="16"/>
-              </w:rPr>
-              <w:t>25</w:t>
+              <w:t>27</w:t>
             </w:r>
           </w:p>
         </w:tc>
@@ -3870,134 +4075,7 @@
                 <w:i w:val="0"/>
                 <w:sz w:val="16"/>
               </w:rPr>
-              <w:t>26</w:t>
-            </w:r>
-          </w:p>
-        </w:tc>
-        <w:tc>
-          <w:tcPr>
-            <w:tcW w:type="dxa" w:w="907"/>
-            <w:vAlign w:val="center"/>
-          </w:tcPr>
-          <w:p>
-            <w:pPr>
-              <w:spacing w:before="20" w:after="20" w:line="240" w:lineRule="auto"/>
-              <w:jc w:val="center"/>
-            </w:pPr>
-            <w:r>
-              <w:rPr>
-                <w:rFonts w:ascii="Arial" w:hAnsi="Arial" w:eastAsia="Arial"/>
-                <w:b/>
-                <w:i w:val="0"/>
-                <w:color w:val="7B1E2B"/>
-                <w:sz w:val="16"/>
-              </w:rPr>
-              <w:t>DPL-26</w:t>
-            </w:r>
-          </w:p>
-        </w:tc>
-        <w:tc>
-          <w:tcPr>
-            <w:tcW w:type="dxa" w:w="6407"/>
-            <w:vAlign w:val="center"/>
-          </w:tcPr>
-          <w:p>
-            <w:pPr>
-              <w:spacing w:before="20" w:after="20" w:line="240" w:lineRule="auto"/>
-              <w:jc w:val="left"/>
-            </w:pPr>
-            <w:r>
-              <w:rPr>
-                <w:rFonts w:ascii="Arial" w:hAnsi="Arial" w:eastAsia="Arial"/>
-                <w:b/>
-                <w:i w:val="0"/>
-                <w:sz w:val="16"/>
-              </w:rPr>
-              <w:t>CAJA DE LLEGADA (0+000) Y CAJA DE CAÍDA CON POZA DE DISIPACIÓN (ENTREGA AL CAR MUJERES)</w:t>
-            </w:r>
-          </w:p>
-        </w:tc>
-        <w:tc>
-          <w:tcPr>
-            <w:tcW w:type="dxa" w:w="1020"/>
-            <w:vAlign w:val="center"/>
-          </w:tcPr>
-          <w:p>
-            <w:pPr>
-              <w:spacing w:before="20" w:after="20" w:line="240" w:lineRule="auto"/>
-              <w:jc w:val="center"/>
-            </w:pPr>
-            <w:r>
-              <w:rPr>
-                <w:rFonts w:ascii="Arial" w:hAnsi="Arial" w:eastAsia="Arial"/>
-                <w:b w:val="0"/>
-                <w:i w:val="0"/>
-                <w:sz w:val="16"/>
-              </w:rPr>
-              <w:t>A1</w:t>
-            </w:r>
-          </w:p>
-        </w:tc>
-        <w:tc>
-          <w:tcPr>
-            <w:tcW w:type="dxa" w:w="1077"/>
-            <w:vAlign w:val="center"/>
-          </w:tcPr>
-          <w:p>
-            <w:pPr>
-              <w:spacing w:before="20" w:after="20" w:line="240" w:lineRule="auto"/>
-              <w:jc w:val="center"/>
-            </w:pPr>
-            <w:r>
-              <w:rPr>
-                <w:rFonts w:ascii="Arial" w:hAnsi="Arial" w:eastAsia="Arial"/>
-                <w:b w:val="0"/>
-                <w:i w:val="0"/>
-                <w:sz w:val="16"/>
-              </w:rPr>
-              <w:t>INDICADA</w:t>
-            </w:r>
-          </w:p>
-          <w:p>
-            <w:pPr>
-              <w:spacing w:before="0" w:after="20" w:line="240" w:lineRule="auto"/>
-              <w:jc w:val="center"/>
-            </w:pPr>
-            <w:r>
-              <w:rPr>
-                <w:rFonts w:ascii="Arial" w:hAnsi="Arial" w:eastAsia="Arial"/>
-                <w:b w:val="0"/>
-                <w:i w:val="0"/>
-                <w:color w:val="595959"/>
-                <w:sz w:val="13"/>
-              </w:rPr>
-              <w:t>1/25, 1/30</w:t>
-            </w:r>
-          </w:p>
-        </w:tc>
-      </w:tr>
-      <w:tr>
-        <w:trPr>
-          <w:cantSplit/>
-        </w:trPr>
-        <w:tc>
-          <w:tcPr>
-            <w:tcW w:type="dxa" w:w="454"/>
-            <w:vAlign w:val="center"/>
-          </w:tcPr>
-          <w:p>
-            <w:pPr>
-              <w:spacing w:before="20" w:after="20" w:line="240" w:lineRule="auto"/>
-              <w:jc w:val="center"/>
-            </w:pPr>
-            <w:r>
-              <w:rPr>
-                <w:rFonts w:ascii="Arial" w:hAnsi="Arial" w:eastAsia="Arial"/>
-                <w:b w:val="0"/>
-                <w:i w:val="0"/>
-                <w:sz w:val="16"/>
-              </w:rPr>
-              <w:t>27</w:t>
+              <w:t>28</w:t>
             </w:r>
           </w:p>
         </w:tc>
@@ -4124,7 +4202,7 @@
                 <w:i w:val="0"/>
                 <w:sz w:val="16"/>
               </w:rPr>
-              <w:t>28</w:t>
+              <w:t>29</w:t>
             </w:r>
           </w:p>
         </w:tc>
@@ -4251,7 +4329,7 @@
                 <w:i w:val="0"/>
                 <w:sz w:val="16"/>
               </w:rPr>
-              <w:t>29</w:t>
+              <w:t>30</w:t>
             </w:r>
           </w:p>
         </w:tc>
@@ -4360,36 +4438,6 @@
       <w:tr>
         <w:trPr>
           <w:cantSplit/>
-          <w:cantSplit/>
-        </w:trPr>
-        <w:tc>
-          <w:tcPr>
-            <w:tcW w:type="dxa" w:w="9864"/>
-            <w:gridSpan w:val="5"/>
-            <w:shd w:val="clear" w:color="auto" w:fill="F2E6E8"/>
-            <w:vAlign w:val="center"/>
-          </w:tcPr>
-          <w:p>
-            <w:pPr>
-              <w:spacing w:before="20" w:after="20" w:line="240" w:lineRule="auto"/>
-              <w:jc w:val="left"/>
-            </w:pPr>
-            <w:r>
-              <w:rPr>
-                <w:rFonts w:ascii="Arial" w:hAnsi="Arial" w:eastAsia="Arial"/>
-                <w:b/>
-                <w:i w:val="0"/>
-                <w:color w:val="7B1E2B"/>
-                <w:sz w:val="15"/>
-              </w:rPr>
-              <w:t>CANALETAS Y MONTANTES PLUVIALES  (DPL-30 A DPL-34)</w:t>
-            </w:r>
-          </w:p>
-        </w:tc>
-      </w:tr>
-      <w:tr>
-        <w:trPr>
-          <w:cantSplit/>
         </w:trPr>
         <w:tc>
           <w:tcPr>
@@ -4408,7 +4456,7 @@
                 <w:i w:val="0"/>
                 <w:sz w:val="16"/>
               </w:rPr>
-              <w:t>30</w:t>
+              <w:t>31</w:t>
             </w:r>
           </w:p>
         </w:tc>
@@ -4535,7 +4583,560 @@
                 <w:i w:val="0"/>
                 <w:sz w:val="16"/>
               </w:rPr>
-              <w:t>31</w:t>
+              <w:t>32</w:t>
+            </w:r>
+          </w:p>
+        </w:tc>
+        <w:tc>
+          <w:tcPr>
+            <w:tcW w:type="dxa" w:w="907"/>
+            <w:vAlign w:val="center"/>
+          </w:tcPr>
+          <w:p>
+            <w:pPr>
+              <w:spacing w:before="20" w:after="20" w:line="240" w:lineRule="auto"/>
+              <w:jc w:val="center"/>
+            </w:pPr>
+            <w:r>
+              <w:rPr>
+                <w:rFonts w:ascii="Arial" w:hAnsi="Arial" w:eastAsia="Arial"/>
+                <w:b/>
+                <w:i w:val="0"/>
+                <w:color w:val="7B1E2B"/>
+                <w:sz w:val="16"/>
+              </w:rPr>
+              <w:t>DPL-33</w:t>
+            </w:r>
+          </w:p>
+        </w:tc>
+        <w:tc>
+          <w:tcPr>
+            <w:tcW w:type="dxa" w:w="6407"/>
+            <w:vAlign w:val="center"/>
+          </w:tcPr>
+          <w:p>
+            <w:pPr>
+              <w:spacing w:before="20" w:after="20" w:line="240" w:lineRule="auto"/>
+              <w:jc w:val="left"/>
+            </w:pPr>
+            <w:r>
+              <w:rPr>
+                <w:rFonts w:ascii="Arial" w:hAnsi="Arial" w:eastAsia="Arial"/>
+                <w:b/>
+                <w:i w:val="0"/>
+                <w:sz w:val="16"/>
+              </w:rPr>
+              <w:t>ELEVACIÓN DE CANALETA Y CORTE DEL MONTANTE PLUVIAL</w:t>
+            </w:r>
+          </w:p>
+        </w:tc>
+        <w:tc>
+          <w:tcPr>
+            <w:tcW w:type="dxa" w:w="1020"/>
+            <w:vAlign w:val="center"/>
+          </w:tcPr>
+          <w:p>
+            <w:pPr>
+              <w:spacing w:before="20" w:after="20" w:line="240" w:lineRule="auto"/>
+              <w:jc w:val="center"/>
+            </w:pPr>
+            <w:r>
+              <w:rPr>
+                <w:rFonts w:ascii="Arial" w:hAnsi="Arial" w:eastAsia="Arial"/>
+                <w:b w:val="0"/>
+                <w:i w:val="0"/>
+                <w:sz w:val="16"/>
+              </w:rPr>
+              <w:t>A2</w:t>
+            </w:r>
+          </w:p>
+        </w:tc>
+        <w:tc>
+          <w:tcPr>
+            <w:tcW w:type="dxa" w:w="1077"/>
+            <w:vAlign w:val="center"/>
+          </w:tcPr>
+          <w:p>
+            <w:pPr>
+              <w:spacing w:before="20" w:after="20" w:line="240" w:lineRule="auto"/>
+              <w:jc w:val="center"/>
+            </w:pPr>
+            <w:r>
+              <w:rPr>
+                <w:rFonts w:ascii="Arial" w:hAnsi="Arial" w:eastAsia="Arial"/>
+                <w:b w:val="0"/>
+                <w:i w:val="0"/>
+                <w:sz w:val="16"/>
+              </w:rPr>
+              <w:t>INDICADA</w:t>
+            </w:r>
+          </w:p>
+          <w:p>
+            <w:pPr>
+              <w:spacing w:before="0" w:after="20" w:line="240" w:lineRule="auto"/>
+              <w:jc w:val="center"/>
+            </w:pPr>
+            <w:r>
+              <w:rPr>
+                <w:rFonts w:ascii="Arial" w:hAnsi="Arial" w:eastAsia="Arial"/>
+                <w:b w:val="0"/>
+                <w:i w:val="0"/>
+                <w:color w:val="595959"/>
+                <w:sz w:val="13"/>
+              </w:rPr>
+              <w:t>1/10, 1/15</w:t>
+            </w:r>
+          </w:p>
+        </w:tc>
+      </w:tr>
+      <w:tr>
+        <w:trPr>
+          <w:cantSplit/>
+        </w:trPr>
+        <w:tc>
+          <w:tcPr>
+            <w:tcW w:type="dxa" w:w="454"/>
+            <w:vAlign w:val="center"/>
+          </w:tcPr>
+          <w:p>
+            <w:pPr>
+              <w:spacing w:before="20" w:after="20" w:line="240" w:lineRule="auto"/>
+              <w:jc w:val="center"/>
+            </w:pPr>
+            <w:r>
+              <w:rPr>
+                <w:rFonts w:ascii="Arial" w:hAnsi="Arial" w:eastAsia="Arial"/>
+                <w:b w:val="0"/>
+                <w:i w:val="0"/>
+                <w:sz w:val="16"/>
+              </w:rPr>
+              <w:t>33</w:t>
+            </w:r>
+          </w:p>
+        </w:tc>
+        <w:tc>
+          <w:tcPr>
+            <w:tcW w:type="dxa" w:w="907"/>
+            <w:vAlign w:val="center"/>
+          </w:tcPr>
+          <w:p>
+            <w:pPr>
+              <w:spacing w:before="20" w:after="20" w:line="240" w:lineRule="auto"/>
+              <w:jc w:val="center"/>
+            </w:pPr>
+            <w:r>
+              <w:rPr>
+                <w:rFonts w:ascii="Arial" w:hAnsi="Arial" w:eastAsia="Arial"/>
+                <w:b/>
+                <w:i w:val="0"/>
+                <w:color w:val="7B1E2B"/>
+                <w:sz w:val="16"/>
+              </w:rPr>
+              <w:t>DPL-34</w:t>
+            </w:r>
+          </w:p>
+        </w:tc>
+        <w:tc>
+          <w:tcPr>
+            <w:tcW w:type="dxa" w:w="6407"/>
+            <w:vAlign w:val="center"/>
+          </w:tcPr>
+          <w:p>
+            <w:pPr>
+              <w:spacing w:before="20" w:after="20" w:line="240" w:lineRule="auto"/>
+              <w:jc w:val="left"/>
+            </w:pPr>
+            <w:r>
+              <w:rPr>
+                <w:rFonts w:ascii="Arial" w:hAnsi="Arial" w:eastAsia="Arial"/>
+                <w:b/>
+                <w:i w:val="0"/>
+                <w:sz w:val="16"/>
+              </w:rPr>
+              <w:t>ISOMÉTRICO DEL MONTANTE PLUVIAL TÍPICO</w:t>
+            </w:r>
+          </w:p>
+        </w:tc>
+        <w:tc>
+          <w:tcPr>
+            <w:tcW w:type="dxa" w:w="1020"/>
+            <w:vAlign w:val="center"/>
+          </w:tcPr>
+          <w:p>
+            <w:pPr>
+              <w:spacing w:before="20" w:after="20" w:line="240" w:lineRule="auto"/>
+              <w:jc w:val="center"/>
+            </w:pPr>
+            <w:r>
+              <w:rPr>
+                <w:rFonts w:ascii="Arial" w:hAnsi="Arial" w:eastAsia="Arial"/>
+                <w:b w:val="0"/>
+                <w:i w:val="0"/>
+                <w:sz w:val="16"/>
+              </w:rPr>
+              <w:t>A2</w:t>
+            </w:r>
+          </w:p>
+        </w:tc>
+        <w:tc>
+          <w:tcPr>
+            <w:tcW w:type="dxa" w:w="1077"/>
+            <w:vAlign w:val="center"/>
+          </w:tcPr>
+          <w:p>
+            <w:pPr>
+              <w:spacing w:before="20" w:after="20" w:line="240" w:lineRule="auto"/>
+              <w:jc w:val="center"/>
+            </w:pPr>
+            <w:r>
+              <w:rPr>
+                <w:rFonts w:ascii="Arial" w:hAnsi="Arial" w:eastAsia="Arial"/>
+                <w:b w:val="0"/>
+                <w:i w:val="0"/>
+                <w:sz w:val="16"/>
+              </w:rPr>
+              <w:t>INDICADA</w:t>
+            </w:r>
+          </w:p>
+          <w:p>
+            <w:pPr>
+              <w:spacing w:before="0" w:after="20" w:line="240" w:lineRule="auto"/>
+              <w:jc w:val="center"/>
+            </w:pPr>
+            <w:r>
+              <w:rPr>
+                <w:rFonts w:ascii="Arial" w:hAnsi="Arial" w:eastAsia="Arial"/>
+                <w:b w:val="0"/>
+                <w:i w:val="0"/>
+                <w:color w:val="595959"/>
+                <w:sz w:val="13"/>
+              </w:rPr>
+              <w:t>1/15, 1/17</w:t>
+            </w:r>
+          </w:p>
+        </w:tc>
+      </w:tr>
+      <w:tr>
+        <w:trPr>
+          <w:cantSplit/>
+        </w:trPr>
+        <w:tc>
+          <w:tcPr>
+            <w:tcW w:type="dxa" w:w="454"/>
+            <w:vAlign w:val="center"/>
+          </w:tcPr>
+          <w:p>
+            <w:pPr>
+              <w:spacing w:before="20" w:after="20" w:line="240" w:lineRule="auto"/>
+              <w:jc w:val="center"/>
+            </w:pPr>
+            <w:r>
+              <w:rPr>
+                <w:rFonts w:ascii="Arial" w:hAnsi="Arial" w:eastAsia="Arial"/>
+                <w:b w:val="0"/>
+                <w:i w:val="0"/>
+                <w:sz w:val="16"/>
+              </w:rPr>
+              <w:t>34</w:t>
+            </w:r>
+          </w:p>
+        </w:tc>
+        <w:tc>
+          <w:tcPr>
+            <w:tcW w:type="dxa" w:w="907"/>
+            <w:vAlign w:val="center"/>
+          </w:tcPr>
+          <w:p>
+            <w:pPr>
+              <w:spacing w:before="20" w:after="20" w:line="240" w:lineRule="auto"/>
+              <w:jc w:val="center"/>
+            </w:pPr>
+            <w:r>
+              <w:rPr>
+                <w:rFonts w:ascii="Arial" w:hAnsi="Arial" w:eastAsia="Arial"/>
+                <w:b/>
+                <w:i w:val="0"/>
+                <w:color w:val="7B1E2B"/>
+                <w:sz w:val="16"/>
+              </w:rPr>
+              <w:t>DPL-37</w:t>
+            </w:r>
+          </w:p>
+        </w:tc>
+        <w:tc>
+          <w:tcPr>
+            <w:tcW w:type="dxa" w:w="6407"/>
+            <w:vAlign w:val="center"/>
+          </w:tcPr>
+          <w:p>
+            <w:pPr>
+              <w:spacing w:before="20" w:after="20" w:line="240" w:lineRule="auto"/>
+              <w:jc w:val="left"/>
+            </w:pPr>
+            <w:r>
+              <w:rPr>
+                <w:rFonts w:ascii="Arial" w:hAnsi="Arial" w:eastAsia="Arial"/>
+                <w:b/>
+                <w:i w:val="0"/>
+                <w:sz w:val="16"/>
+              </w:rPr>
+              <w:t>DETALLE DE LLORADERO: CORTE, TUBO PERFORADO Y DESAGREGADO</w:t>
+            </w:r>
+          </w:p>
+        </w:tc>
+        <w:tc>
+          <w:tcPr>
+            <w:tcW w:type="dxa" w:w="1020"/>
+            <w:vAlign w:val="center"/>
+          </w:tcPr>
+          <w:p>
+            <w:pPr>
+              <w:spacing w:before="20" w:after="20" w:line="240" w:lineRule="auto"/>
+              <w:jc w:val="center"/>
+            </w:pPr>
+            <w:r>
+              <w:rPr>
+                <w:rFonts w:ascii="Arial" w:hAnsi="Arial" w:eastAsia="Arial"/>
+                <w:b w:val="0"/>
+                <w:i w:val="0"/>
+                <w:sz w:val="16"/>
+              </w:rPr>
+              <w:t>A2</w:t>
+            </w:r>
+          </w:p>
+        </w:tc>
+        <w:tc>
+          <w:tcPr>
+            <w:tcW w:type="dxa" w:w="1077"/>
+            <w:vAlign w:val="center"/>
+          </w:tcPr>
+          <w:p>
+            <w:pPr>
+              <w:spacing w:before="20" w:after="20" w:line="240" w:lineRule="auto"/>
+              <w:jc w:val="center"/>
+            </w:pPr>
+            <w:r>
+              <w:rPr>
+                <w:rFonts w:ascii="Arial" w:hAnsi="Arial" w:eastAsia="Arial"/>
+                <w:b w:val="0"/>
+                <w:i w:val="0"/>
+                <w:sz w:val="16"/>
+              </w:rPr>
+              <w:t>INDICADA</w:t>
+            </w:r>
+          </w:p>
+          <w:p>
+            <w:pPr>
+              <w:spacing w:before="0" w:after="20" w:line="240" w:lineRule="auto"/>
+              <w:jc w:val="center"/>
+            </w:pPr>
+            <w:r>
+              <w:rPr>
+                <w:rFonts w:ascii="Arial" w:hAnsi="Arial" w:eastAsia="Arial"/>
+                <w:b w:val="0"/>
+                <w:i w:val="0"/>
+                <w:color w:val="595959"/>
+                <w:sz w:val="13"/>
+              </w:rPr>
+              <w:t>1/5, 1/8</w:t>
+            </w:r>
+          </w:p>
+        </w:tc>
+      </w:tr>
+      <w:tr>
+        <w:trPr>
+          <w:cantSplit/>
+        </w:trPr>
+        <w:tc>
+          <w:tcPr>
+            <w:tcW w:type="dxa" w:w="9864"/>
+            <w:gridSpan w:val="5"/>
+            <w:shd w:val="clear" w:color="auto" w:fill="F2E6E8"/>
+            <w:vAlign w:val="center"/>
+          </w:tcPr>
+          <w:p>
+            <w:pPr>
+              <w:spacing w:before="20" w:after="20" w:line="240" w:lineRule="auto"/>
+              <w:jc w:val="left"/>
+            </w:pPr>
+            <w:r>
+              <w:rPr>
+                <w:rFonts w:ascii="Arial" w:hAnsi="Arial" w:eastAsia="Arial"/>
+                <w:b/>
+                <w:i w:val="0"/>
+                <w:color w:val="7B1E2B"/>
+                <w:sz w:val="15"/>
+              </w:rPr>
+              <w:t>LÁMINAS EN FORMATO A3  (6)</w:t>
+            </w:r>
+          </w:p>
+        </w:tc>
+      </w:tr>
+      <w:tr>
+        <w:trPr>
+          <w:cantSplit/>
+        </w:trPr>
+        <w:tc>
+          <w:tcPr>
+            <w:tcW w:type="dxa" w:w="454"/>
+            <w:vAlign w:val="center"/>
+          </w:tcPr>
+          <w:p>
+            <w:pPr>
+              <w:spacing w:before="20" w:after="20" w:line="240" w:lineRule="auto"/>
+              <w:jc w:val="center"/>
+            </w:pPr>
+            <w:r>
+              <w:rPr>
+                <w:rFonts w:ascii="Arial" w:hAnsi="Arial" w:eastAsia="Arial"/>
+                <w:b w:val="0"/>
+                <w:i w:val="0"/>
+                <w:sz w:val="16"/>
+              </w:rPr>
+              <w:t>35</w:t>
+            </w:r>
+          </w:p>
+        </w:tc>
+        <w:tc>
+          <w:tcPr>
+            <w:tcW w:type="dxa" w:w="907"/>
+            <w:vAlign w:val="center"/>
+          </w:tcPr>
+          <w:p>
+            <w:pPr>
+              <w:spacing w:before="20" w:after="20" w:line="240" w:lineRule="auto"/>
+              <w:jc w:val="center"/>
+            </w:pPr>
+            <w:r>
+              <w:rPr>
+                <w:rFonts w:ascii="Arial" w:hAnsi="Arial" w:eastAsia="Arial"/>
+                <w:b/>
+                <w:i w:val="0"/>
+                <w:color w:val="7B1E2B"/>
+                <w:sz w:val="16"/>
+              </w:rPr>
+              <w:t>DPL-14</w:t>
+            </w:r>
+          </w:p>
+        </w:tc>
+        <w:tc>
+          <w:tcPr>
+            <w:tcW w:type="dxa" w:w="6407"/>
+            <w:vAlign w:val="center"/>
+          </w:tcPr>
+          <w:p>
+            <w:pPr>
+              <w:spacing w:before="20" w:after="20" w:line="240" w:lineRule="auto"/>
+              <w:jc w:val="left"/>
+            </w:pPr>
+            <w:r>
+              <w:rPr>
+                <w:rFonts w:ascii="Arial" w:hAnsi="Arial" w:eastAsia="Arial"/>
+                <w:b/>
+                <w:i w:val="0"/>
+                <w:sz w:val="16"/>
+              </w:rPr>
+              <w:t>ISOMÉTRICOS DE LAS SECCIONES TRANSVERSALES</w:t>
+            </w:r>
+          </w:p>
+          <w:p>
+            <w:pPr>
+              <w:spacing w:before="0" w:after="20" w:line="240" w:lineRule="auto"/>
+              <w:jc w:val="left"/>
+            </w:pPr>
+            <w:r>
+              <w:rPr>
+                <w:rFonts w:ascii="Arial" w:hAnsi="Arial" w:eastAsia="Arial"/>
+                <w:b w:val="0"/>
+                <w:i w:val="0"/>
+                <w:color w:val="595959"/>
+                <w:sz w:val="13"/>
+              </w:rPr>
+              <w:t>SECCIONES TÍPICAS: TRAMO NORMAL (0+010.00), CRUCE DE MOTOS (0+040.00) Y CRUCE DE CAMIONES (0+028.80)</w:t>
+            </w:r>
+          </w:p>
+        </w:tc>
+        <w:tc>
+          <w:tcPr>
+            <w:tcW w:type="dxa" w:w="1020"/>
+            <w:vAlign w:val="center"/>
+          </w:tcPr>
+          <w:p>
+            <w:pPr>
+              <w:spacing w:before="20" w:after="20" w:line="240" w:lineRule="auto"/>
+              <w:jc w:val="center"/>
+            </w:pPr>
+            <w:r>
+              <w:rPr>
+                <w:rFonts w:ascii="Arial" w:hAnsi="Arial" w:eastAsia="Arial"/>
+                <w:b w:val="0"/>
+                <w:i w:val="0"/>
+                <w:sz w:val="16"/>
+              </w:rPr>
+              <w:t>A3</w:t>
+            </w:r>
+          </w:p>
+        </w:tc>
+        <w:tc>
+          <w:tcPr>
+            <w:tcW w:type="dxa" w:w="1077"/>
+            <w:vAlign w:val="center"/>
+          </w:tcPr>
+          <w:p>
+            <w:pPr>
+              <w:spacing w:before="20" w:after="20" w:line="240" w:lineRule="auto"/>
+              <w:jc w:val="center"/>
+            </w:pPr>
+            <w:r>
+              <w:rPr>
+                <w:rFonts w:ascii="Arial" w:hAnsi="Arial" w:eastAsia="Arial"/>
+                <w:b w:val="0"/>
+                <w:i w:val="0"/>
+                <w:sz w:val="16"/>
+              </w:rPr>
+              <w:t>INDICADA</w:t>
+            </w:r>
+          </w:p>
+          <w:p>
+            <w:pPr>
+              <w:spacing w:before="0" w:after="20" w:line="240" w:lineRule="auto"/>
+              <w:jc w:val="center"/>
+            </w:pPr>
+            <w:r>
+              <w:rPr>
+                <w:rFonts w:ascii="Arial" w:hAnsi="Arial" w:eastAsia="Arial"/>
+                <w:b w:val="0"/>
+                <w:i w:val="0"/>
+                <w:color w:val="595959"/>
+                <w:sz w:val="13"/>
+              </w:rPr>
+              <w:t>1/10, 1/20</w:t>
+            </w:r>
+          </w:p>
+        </w:tc>
+      </w:tr>
+      <w:tr>
+        <w:trPr>
+          <w:cantSplit/>
+        </w:trPr>
+        <w:tc>
+          <w:tcPr>
+            <w:tcW w:type="dxa" w:w="454"/>
+            <w:vAlign w:val="center"/>
+          </w:tcPr>
+          <w:p>
+            <w:pPr>
+              <w:spacing w:before="20" w:after="20" w:line="240" w:lineRule="auto"/>
+              <w:jc w:val="center"/>
+            </w:pPr>
+            <w:r>
+              <w:rPr>
+                <w:rFonts w:ascii="Arial" w:hAnsi="Arial" w:eastAsia="Arial"/>
+                <w:b w:val="0"/>
+                <w:i w:val="0"/>
+                <w:sz w:val="16"/>
+              </w:rPr>
+              <w:t>36</w:t>
             </w:r>
           </w:p>
         </w:tc>
@@ -4662,7 +5263,7 @@
                 <w:i w:val="0"/>
                 <w:sz w:val="16"/>
               </w:rPr>
-              <w:t>32</w:t>
+              <w:t>37</w:t>
             </w:r>
           </w:p>
         </w:tc>
@@ -4789,291 +5390,7 @@
                 <w:i w:val="0"/>
                 <w:sz w:val="16"/>
               </w:rPr>
-              <w:t>33</w:t>
-            </w:r>
-          </w:p>
-        </w:tc>
-        <w:tc>
-          <w:tcPr>
-            <w:tcW w:type="dxa" w:w="907"/>
-            <w:vAlign w:val="center"/>
-          </w:tcPr>
-          <w:p>
-            <w:pPr>
-              <w:spacing w:before="20" w:after="20" w:line="240" w:lineRule="auto"/>
-              <w:jc w:val="center"/>
-            </w:pPr>
-            <w:r>
-              <w:rPr>
-                <w:rFonts w:ascii="Arial" w:hAnsi="Arial" w:eastAsia="Arial"/>
-                <w:b/>
-                <w:i w:val="0"/>
-                <w:color w:val="7B1E2B"/>
-                <w:sz w:val="16"/>
-              </w:rPr>
-              <w:t>DPL-33</w:t>
-            </w:r>
-          </w:p>
-        </w:tc>
-        <w:tc>
-          <w:tcPr>
-            <w:tcW w:type="dxa" w:w="6407"/>
-            <w:vAlign w:val="center"/>
-          </w:tcPr>
-          <w:p>
-            <w:pPr>
-              <w:spacing w:before="20" w:after="20" w:line="240" w:lineRule="auto"/>
-              <w:jc w:val="left"/>
-            </w:pPr>
-            <w:r>
-              <w:rPr>
-                <w:rFonts w:ascii="Arial" w:hAnsi="Arial" w:eastAsia="Arial"/>
-                <w:b/>
-                <w:i w:val="0"/>
-                <w:sz w:val="16"/>
-              </w:rPr>
-              <w:t>ELEVACIÓN DE CANALETA Y CORTE DEL MONTANTE PLUVIAL</w:t>
-            </w:r>
-          </w:p>
-        </w:tc>
-        <w:tc>
-          <w:tcPr>
-            <w:tcW w:type="dxa" w:w="1020"/>
-            <w:vAlign w:val="center"/>
-          </w:tcPr>
-          <w:p>
-            <w:pPr>
-              <w:spacing w:before="20" w:after="20" w:line="240" w:lineRule="auto"/>
-              <w:jc w:val="center"/>
-            </w:pPr>
-            <w:r>
-              <w:rPr>
-                <w:rFonts w:ascii="Arial" w:hAnsi="Arial" w:eastAsia="Arial"/>
-                <w:b w:val="0"/>
-                <w:i w:val="0"/>
-                <w:sz w:val="16"/>
-              </w:rPr>
-              <w:t>A2</w:t>
-            </w:r>
-          </w:p>
-        </w:tc>
-        <w:tc>
-          <w:tcPr>
-            <w:tcW w:type="dxa" w:w="1077"/>
-            <w:vAlign w:val="center"/>
-          </w:tcPr>
-          <w:p>
-            <w:pPr>
-              <w:spacing w:before="20" w:after="20" w:line="240" w:lineRule="auto"/>
-              <w:jc w:val="center"/>
-            </w:pPr>
-            <w:r>
-              <w:rPr>
-                <w:rFonts w:ascii="Arial" w:hAnsi="Arial" w:eastAsia="Arial"/>
-                <w:b w:val="0"/>
-                <w:i w:val="0"/>
-                <w:sz w:val="16"/>
-              </w:rPr>
-              <w:t>INDICADA</w:t>
-            </w:r>
-          </w:p>
-          <w:p>
-            <w:pPr>
-              <w:spacing w:before="0" w:after="20" w:line="240" w:lineRule="auto"/>
-              <w:jc w:val="center"/>
-            </w:pPr>
-            <w:r>
-              <w:rPr>
-                <w:rFonts w:ascii="Arial" w:hAnsi="Arial" w:eastAsia="Arial"/>
-                <w:b w:val="0"/>
-                <w:i w:val="0"/>
-                <w:color w:val="595959"/>
-                <w:sz w:val="13"/>
-              </w:rPr>
-              <w:t>1/10, 1/15</w:t>
-            </w:r>
-          </w:p>
-        </w:tc>
-      </w:tr>
-      <w:tr>
-        <w:trPr>
-          <w:cantSplit/>
-        </w:trPr>
-        <w:tc>
-          <w:tcPr>
-            <w:tcW w:type="dxa" w:w="454"/>
-            <w:vAlign w:val="center"/>
-          </w:tcPr>
-          <w:p>
-            <w:pPr>
-              <w:spacing w:before="20" w:after="20" w:line="240" w:lineRule="auto"/>
-              <w:jc w:val="center"/>
-            </w:pPr>
-            <w:r>
-              <w:rPr>
-                <w:rFonts w:ascii="Arial" w:hAnsi="Arial" w:eastAsia="Arial"/>
-                <w:b w:val="0"/>
-                <w:i w:val="0"/>
-                <w:sz w:val="16"/>
-              </w:rPr>
-              <w:t>34</w:t>
-            </w:r>
-          </w:p>
-        </w:tc>
-        <w:tc>
-          <w:tcPr>
-            <w:tcW w:type="dxa" w:w="907"/>
-            <w:vAlign w:val="center"/>
-          </w:tcPr>
-          <w:p>
-            <w:pPr>
-              <w:spacing w:before="20" w:after="20" w:line="240" w:lineRule="auto"/>
-              <w:jc w:val="center"/>
-            </w:pPr>
-            <w:r>
-              <w:rPr>
-                <w:rFonts w:ascii="Arial" w:hAnsi="Arial" w:eastAsia="Arial"/>
-                <w:b/>
-                <w:i w:val="0"/>
-                <w:color w:val="7B1E2B"/>
-                <w:sz w:val="16"/>
-              </w:rPr>
-              <w:t>DPL-34</w:t>
-            </w:r>
-          </w:p>
-        </w:tc>
-        <w:tc>
-          <w:tcPr>
-            <w:tcW w:type="dxa" w:w="6407"/>
-            <w:vAlign w:val="center"/>
-          </w:tcPr>
-          <w:p>
-            <w:pPr>
-              <w:spacing w:before="20" w:after="20" w:line="240" w:lineRule="auto"/>
-              <w:jc w:val="left"/>
-            </w:pPr>
-            <w:r>
-              <w:rPr>
-                <w:rFonts w:ascii="Arial" w:hAnsi="Arial" w:eastAsia="Arial"/>
-                <w:b/>
-                <w:i w:val="0"/>
-                <w:sz w:val="16"/>
-              </w:rPr>
-              <w:t>ISOMÉTRICO DEL MONTANTE PLUVIAL TÍPICO</w:t>
-            </w:r>
-          </w:p>
-        </w:tc>
-        <w:tc>
-          <w:tcPr>
-            <w:tcW w:type="dxa" w:w="1020"/>
-            <w:vAlign w:val="center"/>
-          </w:tcPr>
-          <w:p>
-            <w:pPr>
-              <w:spacing w:before="20" w:after="20" w:line="240" w:lineRule="auto"/>
-              <w:jc w:val="center"/>
-            </w:pPr>
-            <w:r>
-              <w:rPr>
-                <w:rFonts w:ascii="Arial" w:hAnsi="Arial" w:eastAsia="Arial"/>
-                <w:b w:val="0"/>
-                <w:i w:val="0"/>
-                <w:sz w:val="16"/>
-              </w:rPr>
-              <w:t>A2</w:t>
-            </w:r>
-          </w:p>
-        </w:tc>
-        <w:tc>
-          <w:tcPr>
-            <w:tcW w:type="dxa" w:w="1077"/>
-            <w:vAlign w:val="center"/>
-          </w:tcPr>
-          <w:p>
-            <w:pPr>
-              <w:spacing w:before="20" w:after="20" w:line="240" w:lineRule="auto"/>
-              <w:jc w:val="center"/>
-            </w:pPr>
-            <w:r>
-              <w:rPr>
-                <w:rFonts w:ascii="Arial" w:hAnsi="Arial" w:eastAsia="Arial"/>
-                <w:b w:val="0"/>
-                <w:i w:val="0"/>
-                <w:sz w:val="16"/>
-              </w:rPr>
-              <w:t>INDICADA</w:t>
-            </w:r>
-          </w:p>
-          <w:p>
-            <w:pPr>
-              <w:spacing w:before="0" w:after="20" w:line="240" w:lineRule="auto"/>
-              <w:jc w:val="center"/>
-            </w:pPr>
-            <w:r>
-              <w:rPr>
-                <w:rFonts w:ascii="Arial" w:hAnsi="Arial" w:eastAsia="Arial"/>
-                <w:b w:val="0"/>
-                <w:i w:val="0"/>
-                <w:color w:val="595959"/>
-                <w:sz w:val="13"/>
-              </w:rPr>
-              <w:t>1/15, 1/17</w:t>
-            </w:r>
-          </w:p>
-        </w:tc>
-      </w:tr>
-      <w:tr>
-        <w:trPr>
-          <w:cantSplit/>
-          <w:cantSplit/>
-        </w:trPr>
-        <w:tc>
-          <w:tcPr>
-            <w:tcW w:type="dxa" w:w="9864"/>
-            <w:gridSpan w:val="5"/>
-            <w:shd w:val="clear" w:color="auto" w:fill="F2E6E8"/>
-            <w:vAlign w:val="center"/>
-          </w:tcPr>
-          <w:p>
-            <w:pPr>
-              <w:spacing w:before="20" w:after="20" w:line="240" w:lineRule="auto"/>
-              <w:jc w:val="left"/>
-            </w:pPr>
-            <w:r>
-              <w:rPr>
-                <w:rFonts w:ascii="Arial" w:hAnsi="Arial" w:eastAsia="Arial"/>
-                <w:b/>
-                <w:i w:val="0"/>
-                <w:color w:val="7B1E2B"/>
-                <w:sz w:val="15"/>
-              </w:rPr>
-              <w:t>CAJA SUMIDERO DE PISO, LLORADEROS Y FALSA COLUMNA  (DPL-35 A DPL-40)</w:t>
-            </w:r>
-          </w:p>
-        </w:tc>
-      </w:tr>
-      <w:tr>
-        <w:trPr>
-          <w:cantSplit/>
-        </w:trPr>
-        <w:tc>
-          <w:tcPr>
-            <w:tcW w:type="dxa" w:w="454"/>
-            <w:vAlign w:val="center"/>
-          </w:tcPr>
-          <w:p>
-            <w:pPr>
-              <w:spacing w:before="20" w:after="20" w:line="240" w:lineRule="auto"/>
-              <w:jc w:val="center"/>
-            </w:pPr>
-            <w:r>
-              <w:rPr>
-                <w:rFonts w:ascii="Arial" w:hAnsi="Arial" w:eastAsia="Arial"/>
-                <w:b w:val="0"/>
-                <w:i w:val="0"/>
-                <w:sz w:val="16"/>
-              </w:rPr>
-              <w:t>35</w:t>
+              <w:t>38</w:t>
             </w:r>
           </w:p>
         </w:tc>
@@ -5200,7 +5517,7 @@
                 <w:i w:val="0"/>
                 <w:sz w:val="16"/>
               </w:rPr>
-              <w:t>36</w:t>
+              <w:t>39</w:t>
             </w:r>
           </w:p>
         </w:tc>
@@ -5327,134 +5644,7 @@
                 <w:i w:val="0"/>
                 <w:sz w:val="16"/>
               </w:rPr>
-              <w:t>37</w:t>
-            </w:r>
-          </w:p>
-        </w:tc>
-        <w:tc>
-          <w:tcPr>
-            <w:tcW w:type="dxa" w:w="907"/>
-            <w:vAlign w:val="center"/>
-          </w:tcPr>
-          <w:p>
-            <w:pPr>
-              <w:spacing w:before="20" w:after="20" w:line="240" w:lineRule="auto"/>
-              <w:jc w:val="center"/>
-            </w:pPr>
-            <w:r>
-              <w:rPr>
-                <w:rFonts w:ascii="Arial" w:hAnsi="Arial" w:eastAsia="Arial"/>
-                <w:b/>
-                <w:i w:val="0"/>
-                <w:color w:val="7B1E2B"/>
-                <w:sz w:val="16"/>
-              </w:rPr>
-              <w:t>DPL-37</w:t>
-            </w:r>
-          </w:p>
-        </w:tc>
-        <w:tc>
-          <w:tcPr>
-            <w:tcW w:type="dxa" w:w="6407"/>
-            <w:vAlign w:val="center"/>
-          </w:tcPr>
-          <w:p>
-            <w:pPr>
-              <w:spacing w:before="20" w:after="20" w:line="240" w:lineRule="auto"/>
-              <w:jc w:val="left"/>
-            </w:pPr>
-            <w:r>
-              <w:rPr>
-                <w:rFonts w:ascii="Arial" w:hAnsi="Arial" w:eastAsia="Arial"/>
-                <w:b/>
-                <w:i w:val="0"/>
-                <w:sz w:val="16"/>
-              </w:rPr>
-              <w:t>DETALLE DE LLORADERO: CORTE, TUBO PERFORADO Y DESAGREGADO</w:t>
-            </w:r>
-          </w:p>
-        </w:tc>
-        <w:tc>
-          <w:tcPr>
-            <w:tcW w:type="dxa" w:w="1020"/>
-            <w:vAlign w:val="center"/>
-          </w:tcPr>
-          <w:p>
-            <w:pPr>
-              <w:spacing w:before="20" w:after="20" w:line="240" w:lineRule="auto"/>
-              <w:jc w:val="center"/>
-            </w:pPr>
-            <w:r>
-              <w:rPr>
-                <w:rFonts w:ascii="Arial" w:hAnsi="Arial" w:eastAsia="Arial"/>
-                <w:b w:val="0"/>
-                <w:i w:val="0"/>
-                <w:sz w:val="16"/>
-              </w:rPr>
-              <w:t>A2</w:t>
-            </w:r>
-          </w:p>
-        </w:tc>
-        <w:tc>
-          <w:tcPr>
-            <w:tcW w:type="dxa" w:w="1077"/>
-            <w:vAlign w:val="center"/>
-          </w:tcPr>
-          <w:p>
-            <w:pPr>
-              <w:spacing w:before="20" w:after="20" w:line="240" w:lineRule="auto"/>
-              <w:jc w:val="center"/>
-            </w:pPr>
-            <w:r>
-              <w:rPr>
-                <w:rFonts w:ascii="Arial" w:hAnsi="Arial" w:eastAsia="Arial"/>
-                <w:b w:val="0"/>
-                <w:i w:val="0"/>
-                <w:sz w:val="16"/>
-              </w:rPr>
-              <w:t>INDICADA</w:t>
-            </w:r>
-          </w:p>
-          <w:p>
-            <w:pPr>
-              <w:spacing w:before="0" w:after="20" w:line="240" w:lineRule="auto"/>
-              <w:jc w:val="center"/>
-            </w:pPr>
-            <w:r>
-              <w:rPr>
-                <w:rFonts w:ascii="Arial" w:hAnsi="Arial" w:eastAsia="Arial"/>
-                <w:b w:val="0"/>
-                <w:i w:val="0"/>
-                <w:color w:val="595959"/>
-                <w:sz w:val="13"/>
-              </w:rPr>
-              <w:t>1/5, 1/8</w:t>
-            </w:r>
-          </w:p>
-        </w:tc>
-      </w:tr>
-      <w:tr>
-        <w:trPr>
-          <w:cantSplit/>
-        </w:trPr>
-        <w:tc>
-          <w:tcPr>
-            <w:tcW w:type="dxa" w:w="454"/>
-            <w:vAlign w:val="center"/>
-          </w:tcPr>
-          <w:p>
-            <w:pPr>
-              <w:spacing w:before="20" w:after="20" w:line="240" w:lineRule="auto"/>
-              <w:jc w:val="center"/>
-            </w:pPr>
-            <w:r>
-              <w:rPr>
-                <w:rFonts w:ascii="Arial" w:hAnsi="Arial" w:eastAsia="Arial"/>
-                <w:b w:val="0"/>
-                <w:i w:val="0"/>
-                <w:sz w:val="16"/>
-              </w:rPr>
-              <w:t>38</w:t>
+              <w:t>40</w:t>
             </w:r>
           </w:p>
         </w:tc>
@@ -5560,624 +5750,6 @@
           </w:p>
         </w:tc>
       </w:tr>
-      <w:tr>
-        <w:trPr>
-          <w:cantSplit/>
-        </w:trPr>
-        <w:tc>
-          <w:tcPr>
-            <w:tcW w:type="dxa" w:w="454"/>
-            <w:vAlign w:val="center"/>
-          </w:tcPr>
-          <w:p>
-            <w:pPr>
-              <w:spacing w:before="20" w:after="20" w:line="240" w:lineRule="auto"/>
-              <w:jc w:val="center"/>
-            </w:pPr>
-            <w:r>
-              <w:rPr>
-                <w:rFonts w:ascii="Arial" w:hAnsi="Arial" w:eastAsia="Arial"/>
-                <w:b w:val="0"/>
-                <w:i w:val="0"/>
-                <w:sz w:val="16"/>
-              </w:rPr>
-              <w:t>39</w:t>
-            </w:r>
-          </w:p>
-        </w:tc>
-        <w:tc>
-          <w:tcPr>
-            <w:tcW w:type="dxa" w:w="907"/>
-            <w:vAlign w:val="center"/>
-          </w:tcPr>
-          <w:p>
-            <w:pPr>
-              <w:spacing w:before="20" w:after="20" w:line="240" w:lineRule="auto"/>
-              <w:jc w:val="center"/>
-            </w:pPr>
-            <w:r>
-              <w:rPr>
-                <w:rFonts w:ascii="Arial" w:hAnsi="Arial" w:eastAsia="Arial"/>
-                <w:b/>
-                <w:i w:val="0"/>
-                <w:color w:val="7B1E2B"/>
-                <w:sz w:val="16"/>
-              </w:rPr>
-              <w:t>DPL-39</w:t>
-            </w:r>
-          </w:p>
-        </w:tc>
-        <w:tc>
-          <w:tcPr>
-            <w:tcW w:type="dxa" w:w="6407"/>
-            <w:vAlign w:val="center"/>
-          </w:tcPr>
-          <w:p>
-            <w:pPr>
-              <w:spacing w:before="20" w:after="20" w:line="240" w:lineRule="auto"/>
-              <w:jc w:val="left"/>
-            </w:pPr>
-            <w:r>
-              <w:rPr>
-                <w:rFonts w:ascii="Arial" w:hAnsi="Arial" w:eastAsia="Arial"/>
-                <w:b/>
-                <w:i w:val="0"/>
-                <w:sz w:val="16"/>
-              </w:rPr>
-              <w:t>PLANTA DE UBICACIÓN DE LLORADEROS EN CUNETAS COLINDANTES CON ÁREA VERDE</w:t>
-            </w:r>
-          </w:p>
-        </w:tc>
-        <w:tc>
-          <w:tcPr>
-            <w:tcW w:type="dxa" w:w="1020"/>
-            <w:vAlign w:val="center"/>
-          </w:tcPr>
-          <w:p>
-            <w:pPr>
-              <w:spacing w:before="20" w:after="20" w:line="240" w:lineRule="auto"/>
-              <w:jc w:val="center"/>
-            </w:pPr>
-            <w:r>
-              <w:rPr>
-                <w:rFonts w:ascii="Arial" w:hAnsi="Arial" w:eastAsia="Arial"/>
-                <w:b w:val="0"/>
-                <w:i w:val="0"/>
-                <w:sz w:val="16"/>
-              </w:rPr>
-              <w:t>A0</w:t>
-            </w:r>
-          </w:p>
-        </w:tc>
-        <w:tc>
-          <w:tcPr>
-            <w:tcW w:type="dxa" w:w="1077"/>
-            <w:vAlign w:val="center"/>
-          </w:tcPr>
-          <w:p>
-            <w:pPr>
-              <w:spacing w:before="20" w:after="20" w:line="240" w:lineRule="auto"/>
-              <w:jc w:val="center"/>
-            </w:pPr>
-            <w:r>
-              <w:rPr>
-                <w:rFonts w:ascii="Arial" w:hAnsi="Arial" w:eastAsia="Arial"/>
-                <w:b w:val="0"/>
-                <w:i w:val="0"/>
-                <w:sz w:val="16"/>
-              </w:rPr>
-              <w:t>INDICADA</w:t>
-            </w:r>
-          </w:p>
-          <w:p>
-            <w:pPr>
-              <w:spacing w:before="0" w:after="20" w:line="240" w:lineRule="auto"/>
-              <w:jc w:val="center"/>
-            </w:pPr>
-            <w:r>
-              <w:rPr>
-                <w:rFonts w:ascii="Arial" w:hAnsi="Arial" w:eastAsia="Arial"/>
-                <w:b w:val="0"/>
-                <w:i w:val="0"/>
-                <w:color w:val="595959"/>
-                <w:sz w:val="13"/>
-              </w:rPr>
-              <w:t>1/180</w:t>
-            </w:r>
-          </w:p>
-        </w:tc>
-      </w:tr>
-      <w:tr>
-        <w:trPr>
-          <w:cantSplit/>
-        </w:trPr>
-        <w:tc>
-          <w:tcPr>
-            <w:tcW w:type="dxa" w:w="454"/>
-            <w:vAlign w:val="center"/>
-          </w:tcPr>
-          <w:p>
-            <w:pPr>
-              <w:spacing w:before="20" w:after="20" w:line="240" w:lineRule="auto"/>
-              <w:jc w:val="center"/>
-            </w:pPr>
-            <w:r>
-              <w:rPr>
-                <w:rFonts w:ascii="Arial" w:hAnsi="Arial" w:eastAsia="Arial"/>
-                <w:b w:val="0"/>
-                <w:i w:val="0"/>
-                <w:sz w:val="16"/>
-              </w:rPr>
-              <w:t>40</w:t>
-            </w:r>
-          </w:p>
-        </w:tc>
-        <w:tc>
-          <w:tcPr>
-            <w:tcW w:type="dxa" w:w="907"/>
-            <w:vAlign w:val="center"/>
-          </w:tcPr>
-          <w:p>
-            <w:pPr>
-              <w:spacing w:before="20" w:after="20" w:line="240" w:lineRule="auto"/>
-              <w:jc w:val="center"/>
-            </w:pPr>
-            <w:r>
-              <w:rPr>
-                <w:rFonts w:ascii="Arial" w:hAnsi="Arial" w:eastAsia="Arial"/>
-                <w:b/>
-                <w:i w:val="0"/>
-                <w:color w:val="7B1E2B"/>
-                <w:sz w:val="16"/>
-              </w:rPr>
-              <w:t>DPL-40</w:t>
-            </w:r>
-          </w:p>
-        </w:tc>
-        <w:tc>
-          <w:tcPr>
-            <w:tcW w:type="dxa" w:w="6407"/>
-            <w:vAlign w:val="center"/>
-          </w:tcPr>
-          <w:p>
-            <w:pPr>
-              <w:spacing w:before="20" w:after="20" w:line="240" w:lineRule="auto"/>
-              <w:jc w:val="left"/>
-            </w:pPr>
-            <w:r>
-              <w:rPr>
-                <w:rFonts w:ascii="Arial" w:hAnsi="Arial" w:eastAsia="Arial"/>
-                <w:b/>
-                <w:i w:val="0"/>
-                <w:sz w:val="16"/>
-              </w:rPr>
-              <w:t>ISOMÉTRICO DE INSTALACIÓN DE LLORADEROS EN CUNETAS</w:t>
-            </w:r>
-          </w:p>
-          <w:p>
-            <w:pPr>
-              <w:spacing w:before="0" w:after="20" w:line="240" w:lineRule="auto"/>
-              <w:jc w:val="left"/>
-            </w:pPr>
-            <w:r>
-              <w:rPr>
-                <w:rFonts w:ascii="Arial" w:hAnsi="Arial" w:eastAsia="Arial"/>
-                <w:b w:val="0"/>
-                <w:i w:val="0"/>
-                <w:color w:val="C00000"/>
-                <w:sz w:val="13"/>
-              </w:rPr>
-              <w:t>Nota: en el rótulo figura DPL-36 (código repetido con el detalle de la caja sumidero); corregir a DPL-40.</w:t>
-            </w:r>
-          </w:p>
-        </w:tc>
-        <w:tc>
-          <w:tcPr>
-            <w:tcW w:type="dxa" w:w="1020"/>
-            <w:vAlign w:val="center"/>
-          </w:tcPr>
-          <w:p>
-            <w:pPr>
-              <w:spacing w:before="20" w:after="20" w:line="240" w:lineRule="auto"/>
-              <w:jc w:val="center"/>
-            </w:pPr>
-            <w:r>
-              <w:rPr>
-                <w:rFonts w:ascii="Arial" w:hAnsi="Arial" w:eastAsia="Arial"/>
-                <w:b w:val="0"/>
-                <w:i w:val="0"/>
-                <w:sz w:val="16"/>
-              </w:rPr>
-              <w:t>A1</w:t>
-            </w:r>
-          </w:p>
-        </w:tc>
-        <w:tc>
-          <w:tcPr>
-            <w:tcW w:type="dxa" w:w="1077"/>
-            <w:vAlign w:val="center"/>
-          </w:tcPr>
-          <w:p>
-            <w:pPr>
-              <w:spacing w:before="20" w:after="20" w:line="240" w:lineRule="auto"/>
-              <w:jc w:val="center"/>
-            </w:pPr>
-            <w:r>
-              <w:rPr>
-                <w:rFonts w:ascii="Arial" w:hAnsi="Arial" w:eastAsia="Arial"/>
-                <w:b w:val="0"/>
-                <w:i w:val="0"/>
-                <w:sz w:val="16"/>
-              </w:rPr>
-              <w:t>INDICADA</w:t>
-            </w:r>
-          </w:p>
-          <w:p>
-            <w:pPr>
-              <w:spacing w:before="0" w:after="20" w:line="240" w:lineRule="auto"/>
-              <w:jc w:val="center"/>
-            </w:pPr>
-            <w:r>
-              <w:rPr>
-                <w:rFonts w:ascii="Arial" w:hAnsi="Arial" w:eastAsia="Arial"/>
-                <w:b w:val="0"/>
-                <w:i w:val="0"/>
-                <w:color w:val="595959"/>
-                <w:sz w:val="13"/>
-              </w:rPr>
-              <w:t>1/10, 1/11</w:t>
-            </w:r>
-          </w:p>
-        </w:tc>
-      </w:tr>
-      <w:tr>
-        <w:trPr>
-          <w:cantSplit/>
-          <w:cantSplit/>
-        </w:trPr>
-        <w:tc>
-          <w:tcPr>
-            <w:tcW w:type="dxa" w:w="9864"/>
-            <w:gridSpan w:val="5"/>
-            <w:shd w:val="clear" w:color="auto" w:fill="F2E6E8"/>
-            <w:vAlign w:val="center"/>
-          </w:tcPr>
-          <w:p>
-            <w:pPr>
-              <w:spacing w:before="20" w:after="20" w:line="240" w:lineRule="auto"/>
-              <w:jc w:val="left"/>
-            </w:pPr>
-            <w:r>
-              <w:rPr>
-                <w:rFonts w:ascii="Arial" w:hAnsi="Arial" w:eastAsia="Arial"/>
-                <w:b/>
-                <w:i w:val="0"/>
-                <w:color w:val="7B1E2B"/>
-                <w:sz w:val="15"/>
-              </w:rPr>
-              <w:t>OBRA COMPLEMENTARIA OC-01: BANCAS CON PÉRGOLA  (DPL-41 A DPL-42)</w:t>
-            </w:r>
-          </w:p>
-        </w:tc>
-      </w:tr>
-      <w:tr>
-        <w:trPr>
-          <w:cantSplit/>
-        </w:trPr>
-        <w:tc>
-          <w:tcPr>
-            <w:tcW w:type="dxa" w:w="454"/>
-            <w:vAlign w:val="center"/>
-          </w:tcPr>
-          <w:p>
-            <w:pPr>
-              <w:spacing w:before="20" w:after="20" w:line="240" w:lineRule="auto"/>
-              <w:jc w:val="center"/>
-            </w:pPr>
-            <w:r>
-              <w:rPr>
-                <w:rFonts w:ascii="Arial" w:hAnsi="Arial" w:eastAsia="Arial"/>
-                <w:b w:val="0"/>
-                <w:i w:val="0"/>
-                <w:sz w:val="16"/>
-              </w:rPr>
-              <w:t>41</w:t>
-            </w:r>
-          </w:p>
-        </w:tc>
-        <w:tc>
-          <w:tcPr>
-            <w:tcW w:type="dxa" w:w="907"/>
-            <w:vAlign w:val="center"/>
-          </w:tcPr>
-          <w:p>
-            <w:pPr>
-              <w:spacing w:before="20" w:after="20" w:line="240" w:lineRule="auto"/>
-              <w:jc w:val="center"/>
-            </w:pPr>
-            <w:r>
-              <w:rPr>
-                <w:rFonts w:ascii="Arial" w:hAnsi="Arial" w:eastAsia="Arial"/>
-                <w:b/>
-                <w:i w:val="0"/>
-                <w:color w:val="7B1E2B"/>
-                <w:sz w:val="16"/>
-              </w:rPr>
-              <w:t>DPL-41</w:t>
-            </w:r>
-          </w:p>
-        </w:tc>
-        <w:tc>
-          <w:tcPr>
-            <w:tcW w:type="dxa" w:w="6407"/>
-            <w:vAlign w:val="center"/>
-          </w:tcPr>
-          <w:p>
-            <w:pPr>
-              <w:spacing w:before="20" w:after="20" w:line="240" w:lineRule="auto"/>
-              <w:jc w:val="left"/>
-            </w:pPr>
-            <w:r>
-              <w:rPr>
-                <w:rFonts w:ascii="Arial" w:hAnsi="Arial" w:eastAsia="Arial"/>
-                <w:b/>
-                <w:i w:val="0"/>
-                <w:sz w:val="16"/>
-              </w:rPr>
-              <w:t>ISOMÉTRICO DEL DRENAJE PLUVIAL DE LA OC-01 (JARDINERA + BANCA + PÉRGOLA)</w:t>
-            </w:r>
-          </w:p>
-          <w:p>
-            <w:pPr>
-              <w:spacing w:before="0" w:after="20" w:line="240" w:lineRule="auto"/>
-              <w:jc w:val="left"/>
-            </w:pPr>
-            <w:r>
-              <w:rPr>
-                <w:rFonts w:ascii="Arial" w:hAnsi="Arial" w:eastAsia="Arial"/>
-                <w:b w:val="0"/>
-                <w:i w:val="0"/>
-                <w:color w:val="595959"/>
-                <w:sz w:val="13"/>
-              </w:rPr>
-              <w:t>3 CANALETAS 0.18 x 0.21 (TECHOS 3.79, 4.21 Y 3.79 m) Y PLANTA DE TECHOS; 3 JUEGOS = 9 BANCAS</w:t>
-            </w:r>
-          </w:p>
-          <w:p>
-            <w:pPr>
-              <w:spacing w:before="0" w:after="20" w:line="240" w:lineRule="auto"/>
-              <w:jc w:val="left"/>
-            </w:pPr>
-            <w:r>
-              <w:rPr>
-                <w:rFonts w:ascii="Arial" w:hAnsi="Arial" w:eastAsia="Arial"/>
-                <w:b w:val="0"/>
-                <w:i w:val="0"/>
-                <w:color w:val="C00000"/>
-                <w:sz w:val="13"/>
-              </w:rPr>
-              <w:t>Lámina en DXF (PLANOS_DRENAJE_OC-01_BANCA_PERGOLA_HOGAR_REFUGIO.dxf); por ploteo con el rótulo del juego.</w:t>
-            </w:r>
-          </w:p>
-        </w:tc>
-        <w:tc>
-          <w:tcPr>
-            <w:tcW w:type="dxa" w:w="1020"/>
-            <w:vAlign w:val="center"/>
-          </w:tcPr>
-          <w:p>
-            <w:pPr>
-              <w:spacing w:before="20" w:after="20" w:line="240" w:lineRule="auto"/>
-              <w:jc w:val="center"/>
-            </w:pPr>
-            <w:r>
-              <w:rPr>
-                <w:rFonts w:ascii="Arial" w:hAnsi="Arial" w:eastAsia="Arial"/>
-                <w:b w:val="0"/>
-                <w:i w:val="0"/>
-                <w:sz w:val="16"/>
-              </w:rPr>
-              <w:t>A1</w:t>
-            </w:r>
-          </w:p>
-        </w:tc>
-        <w:tc>
-          <w:tcPr>
-            <w:tcW w:type="dxa" w:w="1077"/>
-            <w:vAlign w:val="center"/>
-          </w:tcPr>
-          <w:p>
-            <w:pPr>
-              <w:spacing w:before="20" w:after="20" w:line="240" w:lineRule="auto"/>
-              <w:jc w:val="center"/>
-            </w:pPr>
-            <w:r>
-              <w:rPr>
-                <w:rFonts w:ascii="Arial" w:hAnsi="Arial" w:eastAsia="Arial"/>
-                <w:b w:val="0"/>
-                <w:i w:val="0"/>
-                <w:sz w:val="16"/>
-              </w:rPr>
-              <w:t>INDICADA</w:t>
-            </w:r>
-          </w:p>
-          <w:p>
-            <w:pPr>
-              <w:spacing w:before="0" w:after="20" w:line="240" w:lineRule="auto"/>
-              <w:jc w:val="center"/>
-            </w:pPr>
-            <w:r>
-              <w:rPr>
-                <w:rFonts w:ascii="Arial" w:hAnsi="Arial" w:eastAsia="Arial"/>
-                <w:b w:val="0"/>
-                <w:i w:val="0"/>
-                <w:color w:val="595959"/>
-                <w:sz w:val="13"/>
-              </w:rPr>
-              <w:t>1/30, 1/50</w:t>
-            </w:r>
-          </w:p>
-        </w:tc>
-      </w:tr>
-      <w:tr>
-        <w:trPr>
-          <w:cantSplit/>
-        </w:trPr>
-        <w:tc>
-          <w:tcPr>
-            <w:tcW w:type="dxa" w:w="454"/>
-            <w:vAlign w:val="center"/>
-          </w:tcPr>
-          <w:p>
-            <w:pPr>
-              <w:spacing w:before="20" w:after="20" w:line="240" w:lineRule="auto"/>
-              <w:jc w:val="center"/>
-            </w:pPr>
-            <w:r>
-              <w:rPr>
-                <w:rFonts w:ascii="Arial" w:hAnsi="Arial" w:eastAsia="Arial"/>
-                <w:b w:val="0"/>
-                <w:i w:val="0"/>
-                <w:sz w:val="16"/>
-              </w:rPr>
-              <w:t>42</w:t>
-            </w:r>
-          </w:p>
-        </w:tc>
-        <w:tc>
-          <w:tcPr>
-            <w:tcW w:type="dxa" w:w="907"/>
-            <w:vAlign w:val="center"/>
-          </w:tcPr>
-          <w:p>
-            <w:pPr>
-              <w:spacing w:before="20" w:after="20" w:line="240" w:lineRule="auto"/>
-              <w:jc w:val="center"/>
-            </w:pPr>
-            <w:r>
-              <w:rPr>
-                <w:rFonts w:ascii="Arial" w:hAnsi="Arial" w:eastAsia="Arial"/>
-                <w:b/>
-                <w:i w:val="0"/>
-                <w:color w:val="7B1E2B"/>
-                <w:sz w:val="16"/>
-              </w:rPr>
-              <w:t>DPL-42</w:t>
-            </w:r>
-          </w:p>
-        </w:tc>
-        <w:tc>
-          <w:tcPr>
-            <w:tcW w:type="dxa" w:w="6407"/>
-            <w:vAlign w:val="center"/>
-          </w:tcPr>
-          <w:p>
-            <w:pPr>
-              <w:spacing w:before="20" w:after="20" w:line="240" w:lineRule="auto"/>
-              <w:jc w:val="left"/>
-            </w:pPr>
-            <w:r>
-              <w:rPr>
-                <w:rFonts w:ascii="Arial" w:hAnsi="Arial" w:eastAsia="Arial"/>
-                <w:b/>
-                <w:i w:val="0"/>
-                <w:sz w:val="16"/>
-              </w:rPr>
-              <w:t>DETALLE ISOMÉTRICO DE LA SALIDA DE LA CANALETA DE LA OC-01</w:t>
-            </w:r>
-          </w:p>
-          <w:p>
-            <w:pPr>
-              <w:spacing w:before="0" w:after="20" w:line="240" w:lineRule="auto"/>
-              <w:jc w:val="left"/>
-            </w:pPr>
-            <w:r>
-              <w:rPr>
-                <w:rFonts w:ascii="Arial" w:hAnsi="Arial" w:eastAsia="Arial"/>
-                <w:b w:val="0"/>
-                <w:i w:val="0"/>
-                <w:color w:val="595959"/>
-                <w:sz w:val="13"/>
-              </w:rPr>
-              <w:t>BOQUILLA Ø 4", COLGADOR, ABRAZADERA, BAJADA PVC 4" Y CORTE DE LA CANALETA</w:t>
-            </w:r>
-          </w:p>
-          <w:p>
-            <w:pPr>
-              <w:spacing w:before="0" w:after="20" w:line="240" w:lineRule="auto"/>
-              <w:jc w:val="left"/>
-            </w:pPr>
-            <w:r>
-              <w:rPr>
-                <w:rFonts w:ascii="Arial" w:hAnsi="Arial" w:eastAsia="Arial"/>
-                <w:b w:val="0"/>
-                <w:i w:val="0"/>
-                <w:color w:val="C00000"/>
-                <w:sz w:val="13"/>
-              </w:rPr>
-              <w:t>Lámina en DXF (PLANOS_DRENAJE_OC-01_BANCA_PERGOLA_HOGAR_REFUGIO.dxf); por ploteo con el rótulo del juego.</w:t>
-            </w:r>
-          </w:p>
-        </w:tc>
-        <w:tc>
-          <w:tcPr>
-            <w:tcW w:type="dxa" w:w="1020"/>
-            <w:vAlign w:val="center"/>
-          </w:tcPr>
-          <w:p>
-            <w:pPr>
-              <w:spacing w:before="20" w:after="20" w:line="240" w:lineRule="auto"/>
-              <w:jc w:val="center"/>
-            </w:pPr>
-            <w:r>
-              <w:rPr>
-                <w:rFonts w:ascii="Arial" w:hAnsi="Arial" w:eastAsia="Arial"/>
-                <w:b w:val="0"/>
-                <w:i w:val="0"/>
-                <w:sz w:val="16"/>
-              </w:rPr>
-              <w:t>A1</w:t>
-            </w:r>
-          </w:p>
-        </w:tc>
-        <w:tc>
-          <w:tcPr>
-            <w:tcW w:type="dxa" w:w="1077"/>
-            <w:vAlign w:val="center"/>
-          </w:tcPr>
-          <w:p>
-            <w:pPr>
-              <w:spacing w:before="20" w:after="20" w:line="240" w:lineRule="auto"/>
-              <w:jc w:val="center"/>
-            </w:pPr>
-            <w:r>
-              <w:rPr>
-                <w:rFonts w:ascii="Arial" w:hAnsi="Arial" w:eastAsia="Arial"/>
-                <w:b w:val="0"/>
-                <w:i w:val="0"/>
-                <w:sz w:val="16"/>
-              </w:rPr>
-              <w:t>INDICADA</w:t>
-            </w:r>
-          </w:p>
-          <w:p>
-            <w:pPr>
-              <w:spacing w:before="0" w:after="20" w:line="240" w:lineRule="auto"/>
-              <w:jc w:val="center"/>
-            </w:pPr>
-            <w:r>
-              <w:rPr>
-                <w:rFonts w:ascii="Arial" w:hAnsi="Arial" w:eastAsia="Arial"/>
-                <w:b w:val="0"/>
-                <w:i w:val="0"/>
-                <w:color w:val="595959"/>
-                <w:sz w:val="13"/>
-              </w:rPr>
-              <w:t>1/5</w:t>
-            </w:r>
-          </w:p>
-        </w:tc>
-      </w:tr>
     </w:tbl>
     <w:p>
       <w:pPr>
@@ -6191,7 +5763,7 @@
           <w:i w:val="0"/>
           <w:sz w:val="18"/>
         </w:rPr>
-        <w:t>Total: 42 láminas (4 en A0, 9 en A1, 23 en A2, 6 en A3).</w:t>
+        <w:t>Total: 40 láminas (4 en A0, 7 en A1, 23 en A2, 6 en A3).</w:t>
       </w:r>
     </w:p>
     <w:p>
@@ -6207,7 +5779,7 @@
           <w:color w:val="595959"/>
           <w:sz w:val="16"/>
         </w:rPr>
-        <w:t>Escala del rótulo: INDICADA; debajo, en gris, las escalas de los dibujos de cada lámina. Fecha de las láminas: setiembre 2026 (DPL-01 a DPL-40) y octubre 2026 (DPL-41 y DPL-42).</w:t>
+        <w:t>Escala del rótulo: INDICADA; debajo, en gris, las escalas de los dibujos de cada lámina. Fecha de las láminas: setiembre 2026.</w:t>
       </w:r>
     </w:p>
     <w:p>
@@ -6223,7 +5795,7 @@
           <w:color w:val="595959"/>
           <w:sz w:val="16"/>
         </w:rPr>
-        <w:t>El orden del índice es el del juego de láminas en PDF ordenado por código (PLANOS_DRENAJE_PLUVIAL_HOGAR_REFUGIO_ORDENADOS.pdf, 40 páginas, con marcadores por lámina).</w:t>
+        <w:t>El N.° es el orden de la lámina en el juego de planos, organizado por formato de hoja (A0, A1, A2 y A3).</w:t>
       </w:r>
     </w:p>
     <w:sectPr>

</xml_diff>